<commit_message>
realize "Force Cannon" bonus effect
- Добавлен бонусный эффект "Force Cannon" бессмертного Зератула.

```
Отталкивает целевую воздушную единицу на некоторое расстояние
```
</commit_message>
<xml_diff>
--- a/docs/introduction.docx
+++ b/docs/introduction.docx
@@ -1621,14 +1621,12 @@
         </w:rPr>
         <w:t xml:space="preserve">, </w:t>
       </w:r>
-      <w:proofErr w:type="spellStart"/>
       <w:r>
         <w:rPr>
           <w:rFonts w:asciiTheme="majorHAnsi" w:hAnsiTheme="majorHAnsi" w:cstheme="majorHAnsi"/>
         </w:rPr>
         <w:t>катсцен</w:t>
       </w:r>
-      <w:proofErr w:type="spellEnd"/>
       <w:r>
         <w:rPr>
           <w:rFonts w:asciiTheme="majorHAnsi" w:hAnsiTheme="majorHAnsi" w:cstheme="majorHAnsi"/>
@@ -2177,7 +2175,6 @@
         </w:rPr>
         <w:t>-{</w:t>
       </w:r>
-      <w:proofErr w:type="spellStart"/>
       <w:r>
         <w:rPr>
           <w:rFonts w:asciiTheme="majorHAnsi" w:hAnsiTheme="majorHAnsi" w:cstheme="majorHAnsi"/>
@@ -2185,7 +2182,6 @@
         </w:rPr>
         <w:t>NameCommander</w:t>
       </w:r>
-      <w:proofErr w:type="spellEnd"/>
       <w:r>
         <w:rPr>
           <w:rFonts w:asciiTheme="majorHAnsi" w:hAnsiTheme="majorHAnsi" w:cstheme="majorHAnsi"/>
@@ -2302,7 +2298,6 @@
         </w:rPr>
         <w:t>Каждая зависимая модификация командира, должна иметь только одну подключенную зависимость, такую как “</w:t>
       </w:r>
-      <w:proofErr w:type="spellStart"/>
       <w:r>
         <w:rPr>
           <w:rFonts w:asciiTheme="majorHAnsi" w:hAnsiTheme="majorHAnsi" w:cstheme="majorHAnsi"/>
@@ -2310,7 +2305,6 @@
         </w:rPr>
         <w:t>COOPCore</w:t>
       </w:r>
-      <w:proofErr w:type="spellEnd"/>
       <w:r>
         <w:rPr>
           <w:rFonts w:asciiTheme="majorHAnsi" w:hAnsiTheme="majorHAnsi" w:cstheme="majorHAnsi"/>
@@ -2684,21 +2678,7 @@
         <w:rPr>
           <w:rFonts w:asciiTheme="majorHAnsi" w:hAnsiTheme="majorHAnsi" w:cstheme="majorHAnsi"/>
         </w:rPr>
-        <w:t xml:space="preserve">. Это касается всех единиц данных, будь то единица, </w:t>
-      </w:r>
-      <w:proofErr w:type="spellStart"/>
-      <w:r>
-        <w:rPr>
-          <w:rFonts w:asciiTheme="majorHAnsi" w:hAnsiTheme="majorHAnsi" w:cstheme="majorHAnsi"/>
-        </w:rPr>
-        <w:t>Актор</w:t>
-      </w:r>
-      <w:proofErr w:type="spellEnd"/>
-      <w:r>
-        <w:rPr>
-          <w:rFonts w:asciiTheme="majorHAnsi" w:hAnsiTheme="majorHAnsi" w:cstheme="majorHAnsi"/>
-        </w:rPr>
-        <w:t>, Модель, Звук, Набор данных и прочие</w:t>
+        <w:t>. Это касается всех единиц данных, будь то единица, Актор, Модель, Звук, Набор данных и прочие</w:t>
       </w:r>
     </w:p>
     <w:p>
@@ -3031,55 +3011,7 @@
           <w:rFonts w:asciiTheme="majorHAnsi" w:hAnsiTheme="majorHAnsi" w:cstheme="majorHAnsi"/>
           <w:bdr w:val="none" w:sz="0" w:space="0" w:color="auto" w:frame="1"/>
         </w:rPr>
-        <w:t xml:space="preserve">необходимо использовать специальные категории редактора (COMMANDER - </w:t>
-      </w:r>
-      <w:proofErr w:type="spellStart"/>
-      <w:r>
-        <w:rPr>
-          <w:rFonts w:asciiTheme="majorHAnsi" w:hAnsiTheme="majorHAnsi" w:cstheme="majorHAnsi"/>
-          <w:bdr w:val="none" w:sz="0" w:space="0" w:color="auto" w:frame="1"/>
-        </w:rPr>
-        <w:t>Raynor</w:t>
-      </w:r>
-      <w:proofErr w:type="spellEnd"/>
-      <w:r>
-        <w:rPr>
-          <w:rFonts w:asciiTheme="majorHAnsi" w:hAnsiTheme="majorHAnsi" w:cstheme="majorHAnsi"/>
-          <w:bdr w:val="none" w:sz="0" w:space="0" w:color="auto" w:frame="1"/>
-        </w:rPr>
-        <w:t xml:space="preserve">, COMMANDER - </w:t>
-      </w:r>
-      <w:proofErr w:type="spellStart"/>
-      <w:r>
-        <w:rPr>
-          <w:rFonts w:asciiTheme="majorHAnsi" w:hAnsiTheme="majorHAnsi" w:cstheme="majorHAnsi"/>
-          <w:bdr w:val="none" w:sz="0" w:space="0" w:color="auto" w:frame="1"/>
-        </w:rPr>
-        <w:t>Kerrigan</w:t>
-      </w:r>
-      <w:proofErr w:type="spellEnd"/>
-      <w:r>
-        <w:rPr>
-          <w:rFonts w:asciiTheme="majorHAnsi" w:hAnsiTheme="majorHAnsi" w:cstheme="majorHAnsi"/>
-          <w:bdr w:val="none" w:sz="0" w:space="0" w:color="auto" w:frame="1"/>
-        </w:rPr>
-        <w:t xml:space="preserve">, COMMANDER - </w:t>
-      </w:r>
-      <w:proofErr w:type="spellStart"/>
-      <w:r>
-        <w:rPr>
-          <w:rFonts w:asciiTheme="majorHAnsi" w:hAnsiTheme="majorHAnsi" w:cstheme="majorHAnsi"/>
-          <w:bdr w:val="none" w:sz="0" w:space="0" w:color="auto" w:frame="1"/>
-        </w:rPr>
-        <w:t>Artanis</w:t>
-      </w:r>
-      <w:proofErr w:type="spellEnd"/>
-      <w:r>
-        <w:rPr>
-          <w:rFonts w:asciiTheme="majorHAnsi" w:hAnsiTheme="majorHAnsi" w:cstheme="majorHAnsi"/>
-          <w:bdr w:val="none" w:sz="0" w:space="0" w:color="auto" w:frame="1"/>
-        </w:rPr>
-        <w:t xml:space="preserve"> и т.д.). При создании новых данных, всегда выбирайте соответствующую категорию командира. Это значительно облегчит поиск данных, относящихся к конкретному командиру, а также позволит легко определить, какие данные требуют обновления при внесении изменений в геймплей соответствующего командира.</w:t>
+        <w:t>необходимо использовать специальные категории редактора (COMMANDER - Raynor, COMMANDER - Kerrigan, COMMANDER - Artanis и т.д.). При создании новых данных, всегда выбирайте соответствующую категорию командира. Это значительно облегчит поиск данных, относящихся к конкретному командиру, а также позволит легко определить, какие данные требуют обновления при внесении изменений в геймплей соответствующего командира.</w:t>
       </w:r>
     </w:p>
     <w:p>
@@ -3151,36 +3083,360 @@
           <w:bCs/>
           <w:lang w:val="en-CA"/>
         </w:rPr>
-        <w:t>&lt;d stringref</w:t>
-      </w:r>
-      <w:proofErr w:type="gramStart"/>
-      <w:r>
+        <w:t>&lt;d stringref=”Catalog,Entry,Field”/&gt;</w:t>
+      </w:r>
+    </w:p>
+    <w:p>
+      <w:pPr>
         <w:rPr>
           <w:rFonts w:asciiTheme="majorHAnsi" w:hAnsiTheme="majorHAnsi" w:cstheme="majorHAnsi"/>
           <w:b/>
           <w:bCs/>
           <w:lang w:val="en-CA"/>
         </w:rPr>
-        <w:t>=”Catalog</w:t>
-      </w:r>
-      <w:proofErr w:type="gramEnd"/>
-      <w:r>
-        <w:rPr>
-          <w:rFonts w:asciiTheme="majorHAnsi" w:hAnsiTheme="majorHAnsi" w:cstheme="majorHAnsi"/>
+      </w:pPr>
+    </w:p>
+    <w:p>
+      <w:pPr>
+        <w:pStyle w:val="2"/>
+      </w:pPr>
+      <w:r>
+        <w:t>Об Способностях</w:t>
+      </w:r>
+    </w:p>
+    <w:p>
+      <w:pPr>
+        <w:rPr>
+          <w:lang w:val="en-US"/>
+        </w:rPr>
+      </w:pPr>
+    </w:p>
+    <w:p>
+      <w:pPr>
+        <w:pStyle w:val="a9"/>
+        <w:numPr>
+          <w:ilvl w:val="0"/>
+          <w:numId w:val="17"/>
+        </w:numPr>
+      </w:pPr>
+      <w:r>
+        <w:t>Все дополнительные структуры эффектов сложных</w:t>
+      </w:r>
+      <w:r>
+        <w:t xml:space="preserve">, </w:t>
+      </w:r>
+      <w:r>
+        <w:t xml:space="preserve">составных способностей должны быть оформлены как </w:t>
+      </w:r>
+      <w:r>
+        <w:rPr>
           <w:b/>
           <w:bCs/>
-          <w:lang w:val="en-CA"/>
-        </w:rPr>
-        <w:t>,Entry,Field”/&gt;</w:t>
-      </w:r>
-    </w:p>
-    <w:p>
-      <w:pPr>
-        <w:rPr>
-          <w:rFonts w:asciiTheme="majorHAnsi" w:hAnsiTheme="majorHAnsi" w:cstheme="majorHAnsi"/>
+        </w:rPr>
+        <w:t>единица данных</w:t>
+      </w:r>
+      <w:r>
+        <w:t xml:space="preserve">. </w:t>
+      </w:r>
+      <w:r>
+        <w:t>А также каждая сложная способность</w:t>
+      </w:r>
+      <w:r>
+        <w:t xml:space="preserve">, </w:t>
+      </w:r>
+      <w:r>
+        <w:t>состоящая из нескольких дополнительных цепочек эффектов</w:t>
+      </w:r>
+      <w:r>
+        <w:t xml:space="preserve">, </w:t>
+      </w:r>
+      <w:r>
+        <w:t xml:space="preserve">должна иметь собственный эффект </w:t>
+      </w:r>
+      <w:r>
+        <w:rPr>
           <w:b/>
           <w:bCs/>
-          <w:lang w:val="en-CA"/>
+          <w:lang w:val="en-US"/>
+        </w:rPr>
+        <w:t>Set</w:t>
+      </w:r>
+      <w:r>
+        <w:t xml:space="preserve"> “@</w:t>
+      </w:r>
+      <w:r>
+        <w:rPr>
+          <w:lang w:val="en-US"/>
+        </w:rPr>
+        <w:t>Effects</w:t>
+      </w:r>
+      <w:r>
+        <w:t xml:space="preserve">”, </w:t>
+      </w:r>
+      <w:r>
+        <w:t xml:space="preserve">в котором будут перечислены все </w:t>
+      </w:r>
+      <w:r>
+        <w:rPr>
+          <w:i/>
+          <w:iCs/>
+        </w:rPr>
+        <w:softHyphen/>
+      </w:r>
+      <w:r>
+        <w:rPr>
+          <w:i/>
+          <w:iCs/>
+          <w:u w:val="single"/>
+        </w:rPr>
+        <w:t>головные эффекты</w:t>
+      </w:r>
+      <w:r>
+        <w:t xml:space="preserve"> дополнительных цепочек эффектов</w:t>
+      </w:r>
+      <w:r>
+        <w:t>.</w:t>
+      </w:r>
+    </w:p>
+    <w:p>
+      <w:pPr>
+        <w:pStyle w:val="a9"/>
+      </w:pPr>
+    </w:p>
+    <w:p>
+      <w:pPr>
+        <w:pStyle w:val="a9"/>
+        <w:rPr>
+          <w:i/>
+          <w:iCs/>
+          <w:sz w:val="20"/>
+          <w:szCs w:val="20"/>
+        </w:rPr>
+      </w:pPr>
+      <w:r>
+        <w:rPr>
+          <w:i/>
+          <w:iCs/>
+          <w:sz w:val="20"/>
+          <w:szCs w:val="20"/>
+        </w:rPr>
+        <w:t>Примечание</w:t>
+      </w:r>
+      <w:r>
+        <w:rPr>
+          <w:i/>
+          <w:iCs/>
+          <w:sz w:val="20"/>
+          <w:szCs w:val="20"/>
+        </w:rPr>
+        <w:t xml:space="preserve">: </w:t>
+      </w:r>
+      <w:r>
+        <w:rPr>
+          <w:i/>
+          <w:iCs/>
+          <w:sz w:val="20"/>
+          <w:szCs w:val="20"/>
+        </w:rPr>
+        <w:t>это нужно для тог</w:t>
+      </w:r>
+      <w:r>
+        <w:rPr>
+          <w:i/>
+          <w:iCs/>
+          <w:sz w:val="20"/>
+          <w:szCs w:val="20"/>
+        </w:rPr>
+        <w:t>о</w:t>
+      </w:r>
+      <w:r>
+        <w:rPr>
+          <w:i/>
+          <w:iCs/>
+          <w:sz w:val="20"/>
+          <w:szCs w:val="20"/>
+        </w:rPr>
+        <w:t>,</w:t>
+      </w:r>
+      <w:r>
+        <w:rPr>
+          <w:i/>
+          <w:iCs/>
+          <w:sz w:val="20"/>
+          <w:szCs w:val="20"/>
+        </w:rPr>
+        <w:t xml:space="preserve"> чтобы каждая дополнительная часть способности считалась отдельной </w:t>
+      </w:r>
+      <w:r>
+        <w:rPr>
+          <w:i/>
+          <w:iCs/>
+          <w:sz w:val="20"/>
+          <w:szCs w:val="20"/>
+        </w:rPr>
+        <w:t>“</w:t>
+      </w:r>
+      <w:r>
+        <w:rPr>
+          <w:i/>
+          <w:iCs/>
+          <w:sz w:val="20"/>
+          <w:szCs w:val="20"/>
+        </w:rPr>
+        <w:t>пассивной способностью</w:t>
+      </w:r>
+      <w:r>
+        <w:rPr>
+          <w:i/>
+          <w:iCs/>
+          <w:sz w:val="20"/>
+          <w:szCs w:val="20"/>
+        </w:rPr>
+        <w:t xml:space="preserve">”, </w:t>
+      </w:r>
+      <w:r>
+        <w:rPr>
+          <w:i/>
+          <w:iCs/>
+          <w:sz w:val="20"/>
+          <w:szCs w:val="20"/>
+        </w:rPr>
+        <w:t xml:space="preserve">которую при желании можно было бы добавить в любой эффект </w:t>
+      </w:r>
+      <w:r>
+        <w:rPr>
+          <w:i/>
+          <w:iCs/>
+          <w:sz w:val="20"/>
+          <w:szCs w:val="20"/>
+        </w:rPr>
+        <w:t>“@</w:t>
+      </w:r>
+      <w:r>
+        <w:rPr>
+          <w:i/>
+          <w:iCs/>
+          <w:sz w:val="20"/>
+          <w:szCs w:val="20"/>
+          <w:lang w:val="en-US"/>
+        </w:rPr>
+        <w:t>Effects</w:t>
+      </w:r>
+      <w:r>
+        <w:rPr>
+          <w:i/>
+          <w:iCs/>
+          <w:sz w:val="20"/>
+          <w:szCs w:val="20"/>
+        </w:rPr>
+        <w:t xml:space="preserve">” </w:t>
+      </w:r>
+      <w:r>
+        <w:rPr>
+          <w:i/>
+          <w:iCs/>
+          <w:sz w:val="20"/>
+          <w:szCs w:val="20"/>
+        </w:rPr>
+        <w:t>для любой другой</w:t>
+      </w:r>
+      <w:r>
+        <w:rPr>
+          <w:i/>
+          <w:iCs/>
+          <w:sz w:val="20"/>
+          <w:szCs w:val="20"/>
+        </w:rPr>
+        <w:t xml:space="preserve"> </w:t>
+      </w:r>
+      <w:r>
+        <w:rPr>
+          <w:i/>
+          <w:iCs/>
+          <w:sz w:val="20"/>
+          <w:szCs w:val="20"/>
+        </w:rPr>
+        <w:t>сложной</w:t>
+      </w:r>
+      <w:r>
+        <w:rPr>
+          <w:i/>
+          <w:iCs/>
+          <w:sz w:val="20"/>
+          <w:szCs w:val="20"/>
+        </w:rPr>
+        <w:t xml:space="preserve"> способности</w:t>
+      </w:r>
+      <w:r>
+        <w:rPr>
+          <w:i/>
+          <w:iCs/>
+          <w:sz w:val="20"/>
+          <w:szCs w:val="20"/>
+        </w:rPr>
+        <w:t>.</w:t>
+      </w:r>
+    </w:p>
+    <w:p>
+      <w:pPr>
+        <w:pStyle w:val="a9"/>
+        <w:rPr>
+          <w:i/>
+          <w:iCs/>
+          <w:sz w:val="20"/>
+          <w:szCs w:val="20"/>
+        </w:rPr>
+      </w:pPr>
+    </w:p>
+    <w:p>
+      <w:pPr>
+        <w:pStyle w:val="a9"/>
+        <w:numPr>
+          <w:ilvl w:val="0"/>
+          <w:numId w:val="17"/>
+        </w:numPr>
+        <w:rPr>
+          <w:i/>
+          <w:iCs/>
+          <w:sz w:val="20"/>
+          <w:szCs w:val="20"/>
+        </w:rPr>
+      </w:pPr>
+      <w:r>
+        <w:t xml:space="preserve">Дополнительный эффект стоит выносить в </w:t>
+      </w:r>
+      <w:r>
+        <w:rPr>
+          <w:b/>
+          <w:bCs/>
+        </w:rPr>
+        <w:t>единицу данных</w:t>
+      </w:r>
+      <w:r>
+        <w:t xml:space="preserve"> только в том случае</w:t>
+      </w:r>
+      <w:r>
+        <w:t xml:space="preserve">, </w:t>
+      </w:r>
+      <w:r>
+        <w:t>если этот эффект является самостоятельной частью</w:t>
+      </w:r>
+      <w:r>
+        <w:t xml:space="preserve">, </w:t>
+      </w:r>
+      <w:r>
+        <w:t>не зависящая напрямую от остальной цепочки эффектов</w:t>
+      </w:r>
+      <w:r>
+        <w:t>.</w:t>
+      </w:r>
+    </w:p>
+    <w:p>
+      <w:pPr>
+        <w:rPr>
+          <w:rFonts w:asciiTheme="majorHAnsi" w:hAnsiTheme="majorHAnsi" w:cstheme="majorHAnsi"/>
+          <w:b/>
+          <w:bCs/>
         </w:rPr>
       </w:pPr>
     </w:p>
@@ -3312,7 +3568,6 @@
       <w:r>
         <w:t xml:space="preserve">для командира </w:t>
       </w:r>
-      <w:proofErr w:type="spellStart"/>
       <w:r>
         <w:rPr>
           <w:b/>
@@ -3320,7 +3575,6 @@
         </w:rPr>
         <w:t>Рейнора</w:t>
       </w:r>
-      <w:proofErr w:type="spellEnd"/>
       <w:r>
         <w:rPr>
           <w:lang w:val="en-CA"/>
@@ -3338,7 +3592,6 @@
         </w:rPr>
         <w:t>“</w:t>
       </w:r>
-      <w:proofErr w:type="spellStart"/>
       <w:r>
         <w:rPr>
           <w:rFonts w:ascii="Courier New" w:hAnsi="Courier New" w:cs="Courier New"/>
@@ -3349,7 +3602,6 @@
         </w:rPr>
         <w:t>COOPRaynor</w:t>
       </w:r>
-      <w:proofErr w:type="spellEnd"/>
       <w:r>
         <w:rPr>
           <w:i/>
@@ -3402,15 +3654,7 @@
     <w:p/>
     <w:p>
       <w:r>
-        <w:t>Эта глава посвящена разработке мастеров (</w:t>
-      </w:r>
-      <w:proofErr w:type="spellStart"/>
-      <w:r>
-        <w:t>визардов</w:t>
-      </w:r>
-      <w:proofErr w:type="spellEnd"/>
-      <w:r>
-        <w:t xml:space="preserve">) для набора библиотек </w:t>
+        <w:t xml:space="preserve">Эта глава посвящена разработке мастеров (визардов) для набора библиотек </w:t>
       </w:r>
     </w:p>
     <w:p>
@@ -3511,7 +3755,6 @@
         </w:rPr>
         <w:t>instructions</w:t>
       </w:r>
-      <w:proofErr w:type="gramStart"/>
       <w:r>
         <w:rPr>
           <w:b/>
@@ -3519,7 +3762,6 @@
         </w:rPr>
         <w:t>&gt;&lt; /</w:t>
       </w:r>
-      <w:proofErr w:type="gramEnd"/>
       <w:r>
         <w:rPr>
           <w:b/>
@@ -3653,16 +3895,11 @@
       <w:r>
         <w:t>Пример</w:t>
       </w:r>
-      <w:proofErr w:type="gramStart"/>
       <w:r>
         <w:t xml:space="preserve">: </w:t>
       </w:r>
       <w:r>
-        <w:t>Если</w:t>
-      </w:r>
-      <w:proofErr w:type="gramEnd"/>
-      <w:r>
-        <w:t xml:space="preserve"> у коллекции данных </w:t>
+        <w:t xml:space="preserve">Если у коллекции данных </w:t>
       </w:r>
       <w:r>
         <w:t>“</w:t>
@@ -3789,14 +4026,12 @@
       <w:r>
         <w:t xml:space="preserve"> </w:t>
       </w:r>
-      <w:proofErr w:type="spellStart"/>
       <w:r>
         <w:rPr>
           <w:lang w:val="en-CA"/>
         </w:rPr>
         <w:t>Collecion</w:t>
       </w:r>
-      <w:proofErr w:type="spellEnd"/>
       <w:r>
         <w:t>)</w:t>
       </w:r>
@@ -3850,7 +4085,6 @@
           <w:lang w:val="en-CA"/>
         </w:rPr>
       </w:pPr>
-      <w:proofErr w:type="spellStart"/>
       <w:r>
         <w:rPr>
           <w:b/>
@@ -3858,7 +4092,6 @@
         </w:rPr>
         <w:t>Актор</w:t>
       </w:r>
-      <w:proofErr w:type="spellEnd"/>
       <w:r>
         <w:t xml:space="preserve">, </w:t>
       </w:r>
@@ -5069,6 +5302,95 @@
     </w:lvl>
   </w:abstractNum>
   <w:abstractNum w:abstractNumId="10" w15:restartNumberingAfterBreak="0">
+    <w:nsid w:val="54D07906"/>
+    <w:multiLevelType w:val="hybridMultilevel"/>
+    <w:tmpl w:val="4126E1A6"/>
+    <w:lvl w:ilvl="0" w:tplc="0419000F">
+      <w:start w:val="1"/>
+      <w:numFmt w:val="decimal"/>
+      <w:lvlText w:val="%1."/>
+      <w:lvlJc w:val="left"/>
+      <w:pPr>
+        <w:ind w:left="720" w:hanging="360"/>
+      </w:pPr>
+      <w:rPr>
+        <w:rFonts w:hint="default"/>
+      </w:rPr>
+    </w:lvl>
+    <w:lvl w:ilvl="1" w:tplc="04190019" w:tentative="1">
+      <w:start w:val="1"/>
+      <w:numFmt w:val="lowerLetter"/>
+      <w:lvlText w:val="%2."/>
+      <w:lvlJc w:val="left"/>
+      <w:pPr>
+        <w:ind w:left="1440" w:hanging="360"/>
+      </w:pPr>
+    </w:lvl>
+    <w:lvl w:ilvl="2" w:tplc="0419001B" w:tentative="1">
+      <w:start w:val="1"/>
+      <w:numFmt w:val="lowerRoman"/>
+      <w:lvlText w:val="%3."/>
+      <w:lvlJc w:val="right"/>
+      <w:pPr>
+        <w:ind w:left="2160" w:hanging="180"/>
+      </w:pPr>
+    </w:lvl>
+    <w:lvl w:ilvl="3" w:tplc="0419000F" w:tentative="1">
+      <w:start w:val="1"/>
+      <w:numFmt w:val="decimal"/>
+      <w:lvlText w:val="%4."/>
+      <w:lvlJc w:val="left"/>
+      <w:pPr>
+        <w:ind w:left="2880" w:hanging="360"/>
+      </w:pPr>
+    </w:lvl>
+    <w:lvl w:ilvl="4" w:tplc="04190019" w:tentative="1">
+      <w:start w:val="1"/>
+      <w:numFmt w:val="lowerLetter"/>
+      <w:lvlText w:val="%5."/>
+      <w:lvlJc w:val="left"/>
+      <w:pPr>
+        <w:ind w:left="3600" w:hanging="360"/>
+      </w:pPr>
+    </w:lvl>
+    <w:lvl w:ilvl="5" w:tplc="0419001B" w:tentative="1">
+      <w:start w:val="1"/>
+      <w:numFmt w:val="lowerRoman"/>
+      <w:lvlText w:val="%6."/>
+      <w:lvlJc w:val="right"/>
+      <w:pPr>
+        <w:ind w:left="4320" w:hanging="180"/>
+      </w:pPr>
+    </w:lvl>
+    <w:lvl w:ilvl="6" w:tplc="0419000F" w:tentative="1">
+      <w:start w:val="1"/>
+      <w:numFmt w:val="decimal"/>
+      <w:lvlText w:val="%7."/>
+      <w:lvlJc w:val="left"/>
+      <w:pPr>
+        <w:ind w:left="5040" w:hanging="360"/>
+      </w:pPr>
+    </w:lvl>
+    <w:lvl w:ilvl="7" w:tplc="04190019" w:tentative="1">
+      <w:start w:val="1"/>
+      <w:numFmt w:val="lowerLetter"/>
+      <w:lvlText w:val="%8."/>
+      <w:lvlJc w:val="left"/>
+      <w:pPr>
+        <w:ind w:left="5760" w:hanging="360"/>
+      </w:pPr>
+    </w:lvl>
+    <w:lvl w:ilvl="8" w:tplc="0419001B" w:tentative="1">
+      <w:start w:val="1"/>
+      <w:numFmt w:val="lowerRoman"/>
+      <w:lvlText w:val="%9."/>
+      <w:lvlJc w:val="right"/>
+      <w:pPr>
+        <w:ind w:left="6480" w:hanging="180"/>
+      </w:pPr>
+    </w:lvl>
+  </w:abstractNum>
+  <w:abstractNum w:abstractNumId="11" w15:restartNumberingAfterBreak="0">
     <w:nsid w:val="5A595613"/>
     <w:multiLevelType w:val="hybridMultilevel"/>
     <w:tmpl w:val="C15C6D24"/>
@@ -5159,7 +5481,7 @@
       </w:pPr>
     </w:lvl>
   </w:abstractNum>
-  <w:abstractNum w:abstractNumId="11" w15:restartNumberingAfterBreak="0">
+  <w:abstractNum w:abstractNumId="12" w15:restartNumberingAfterBreak="0">
     <w:nsid w:val="5AE417BE"/>
     <w:multiLevelType w:val="hybridMultilevel"/>
     <w:tmpl w:val="5BA67AB0"/>
@@ -5248,7 +5570,7 @@
       </w:pPr>
     </w:lvl>
   </w:abstractNum>
-  <w:abstractNum w:abstractNumId="12" w15:restartNumberingAfterBreak="0">
+  <w:abstractNum w:abstractNumId="13" w15:restartNumberingAfterBreak="0">
     <w:nsid w:val="60881409"/>
     <w:multiLevelType w:val="hybridMultilevel"/>
     <w:tmpl w:val="6106ACEE"/>
@@ -5337,7 +5659,7 @@
       </w:pPr>
     </w:lvl>
   </w:abstractNum>
-  <w:abstractNum w:abstractNumId="13" w15:restartNumberingAfterBreak="0">
+  <w:abstractNum w:abstractNumId="14" w15:restartNumberingAfterBreak="0">
     <w:nsid w:val="6A076694"/>
     <w:multiLevelType w:val="hybridMultilevel"/>
     <w:tmpl w:val="C96826F2"/>
@@ -5426,7 +5748,7 @@
       </w:pPr>
     </w:lvl>
   </w:abstractNum>
-  <w:abstractNum w:abstractNumId="14" w15:restartNumberingAfterBreak="0">
+  <w:abstractNum w:abstractNumId="15" w15:restartNumberingAfterBreak="0">
     <w:nsid w:val="6EAB575D"/>
     <w:multiLevelType w:val="hybridMultilevel"/>
     <w:tmpl w:val="9D0C58AA"/>
@@ -5515,7 +5837,7 @@
       </w:pPr>
     </w:lvl>
   </w:abstractNum>
-  <w:abstractNum w:abstractNumId="15" w15:restartNumberingAfterBreak="0">
+  <w:abstractNum w:abstractNumId="16" w15:restartNumberingAfterBreak="0">
     <w:nsid w:val="73414BE5"/>
     <w:multiLevelType w:val="hybridMultilevel"/>
     <w:tmpl w:val="A8DA2260"/>
@@ -5605,7 +5927,7 @@
     </w:lvl>
   </w:abstractNum>
   <w:num w:numId="1">
-    <w:abstractNumId w:val="10"/>
+    <w:abstractNumId w:val="11"/>
   </w:num>
   <w:num w:numId="2">
     <w:abstractNumId w:val="2"/>
@@ -5614,7 +5936,7 @@
     <w:abstractNumId w:val="3"/>
   </w:num>
   <w:num w:numId="4">
-    <w:abstractNumId w:val="12"/>
+    <w:abstractNumId w:val="13"/>
   </w:num>
   <w:num w:numId="5">
     <w:abstractNumId w:val="8"/>
@@ -5626,19 +5948,19 @@
     <w:abstractNumId w:val="9"/>
   </w:num>
   <w:num w:numId="8">
-    <w:abstractNumId w:val="11"/>
+    <w:abstractNumId w:val="12"/>
   </w:num>
   <w:num w:numId="9">
     <w:abstractNumId w:val="6"/>
   </w:num>
   <w:num w:numId="10">
+    <w:abstractNumId w:val="16"/>
+  </w:num>
+  <w:num w:numId="11">
     <w:abstractNumId w:val="15"/>
   </w:num>
-  <w:num w:numId="11">
+  <w:num w:numId="12">
     <w:abstractNumId w:val="14"/>
-  </w:num>
-  <w:num w:numId="12">
-    <w:abstractNumId w:val="13"/>
   </w:num>
   <w:num w:numId="13">
     <w:abstractNumId w:val="1"/>
@@ -5651,6 +5973,9 @@
   </w:num>
   <w:num w:numId="16">
     <w:abstractNumId w:val="5"/>
+  </w:num>
+  <w:num w:numId="17">
+    <w:abstractNumId w:val="10"/>
   </w:num>
 </w:numbering>
 </file>

</xml_diff>

<commit_message>
[Zeratul] Maelstorm is ready
</commit_message>
<xml_diff>
--- a/docs/introduction.docx
+++ b/docs/introduction.docx
@@ -149,7 +149,7 @@
             </w:rPr>
             <w:fldChar w:fldCharType="separate"/>
           </w:r>
-          <w:hyperlink w:anchor="_Toc205324063" w:history="1">
+          <w:hyperlink w:anchor="_Toc219644125" w:history="1">
             <w:r>
               <w:rPr>
                 <w:rStyle w:val="a4"/>
@@ -177,7 +177,7 @@
                 <w:noProof/>
                 <w:webHidden/>
               </w:rPr>
-              <w:instrText xml:space="preserve"> PAGEREF _Toc205324063 \h </w:instrText>
+              <w:instrText xml:space="preserve"> PAGEREF _Toc219644125 \h </w:instrText>
             </w:r>
             <w:r>
               <w:rPr>
@@ -220,7 +220,7 @@
               <w:lang w:eastAsia="ru-RU"/>
             </w:rPr>
           </w:pPr>
-          <w:hyperlink w:anchor="_Toc205324064" w:history="1">
+          <w:hyperlink w:anchor="_Toc219644126" w:history="1">
             <w:r>
               <w:rPr>
                 <w:rStyle w:val="a4"/>
@@ -247,7 +247,7 @@
                 <w:noProof/>
                 <w:webHidden/>
               </w:rPr>
-              <w:instrText xml:space="preserve"> PAGEREF _Toc205324064 \h </w:instrText>
+              <w:instrText xml:space="preserve"> PAGEREF _Toc219644126 \h </w:instrText>
             </w:r>
             <w:r>
               <w:rPr>
@@ -290,7 +290,7 @@
               <w:lang w:eastAsia="ru-RU"/>
             </w:rPr>
           </w:pPr>
-          <w:hyperlink w:anchor="_Toc205324065" w:history="1">
+          <w:hyperlink w:anchor="_Toc219644127" w:history="1">
             <w:r>
               <w:rPr>
                 <w:rStyle w:val="a4"/>
@@ -317,7 +317,7 @@
                 <w:noProof/>
                 <w:webHidden/>
               </w:rPr>
-              <w:instrText xml:space="preserve"> PAGEREF _Toc205324065 \h </w:instrText>
+              <w:instrText xml:space="preserve"> PAGEREF _Toc219644127 \h </w:instrText>
             </w:r>
             <w:r>
               <w:rPr>
@@ -360,7 +360,7 @@
               <w:lang w:eastAsia="ru-RU"/>
             </w:rPr>
           </w:pPr>
-          <w:hyperlink w:anchor="_Toc205324066" w:history="1">
+          <w:hyperlink w:anchor="_Toc219644128" w:history="1">
             <w:r>
               <w:rPr>
                 <w:rStyle w:val="a4"/>
@@ -410,7 +410,7 @@
                 <w:noProof/>
                 <w:webHidden/>
               </w:rPr>
-              <w:instrText xml:space="preserve"> PAGEREF _Toc205324066 \h </w:instrText>
+              <w:instrText xml:space="preserve"> PAGEREF _Toc219644128 \h </w:instrText>
             </w:r>
             <w:r>
               <w:rPr>
@@ -453,7 +453,7 @@
               <w:lang w:eastAsia="ru-RU"/>
             </w:rPr>
           </w:pPr>
-          <w:hyperlink w:anchor="_Toc205324067" w:history="1">
+          <w:hyperlink w:anchor="_Toc219644129" w:history="1">
             <w:r>
               <w:rPr>
                 <w:rStyle w:val="a4"/>
@@ -481,7 +481,7 @@
                 <w:noProof/>
                 <w:webHidden/>
               </w:rPr>
-              <w:instrText xml:space="preserve"> PAGEREF _Toc205324067 \h </w:instrText>
+              <w:instrText xml:space="preserve"> PAGEREF _Toc219644129 \h </w:instrText>
             </w:r>
             <w:r>
               <w:rPr>
@@ -524,7 +524,7 @@
               <w:lang w:eastAsia="ru-RU"/>
             </w:rPr>
           </w:pPr>
-          <w:hyperlink w:anchor="_Toc205324068" w:history="1">
+          <w:hyperlink w:anchor="_Toc219644130" w:history="1">
             <w:r>
               <w:rPr>
                 <w:rStyle w:val="a4"/>
@@ -552,7 +552,7 @@
                 <w:noProof/>
                 <w:webHidden/>
               </w:rPr>
-              <w:instrText xml:space="preserve"> PAGEREF _Toc205324068 \h </w:instrText>
+              <w:instrText xml:space="preserve"> PAGEREF _Toc219644130 \h </w:instrText>
             </w:r>
             <w:r>
               <w:rPr>
@@ -595,7 +595,7 @@
               <w:lang w:eastAsia="ru-RU"/>
             </w:rPr>
           </w:pPr>
-          <w:hyperlink w:anchor="_Toc205324069" w:history="1">
+          <w:hyperlink w:anchor="_Toc219644131" w:history="1">
             <w:r>
               <w:rPr>
                 <w:rStyle w:val="a4"/>
@@ -657,7 +657,7 @@
                 <w:noProof/>
                 <w:webHidden/>
               </w:rPr>
-              <w:instrText xml:space="preserve"> PAGEREF _Toc205324069 \h </w:instrText>
+              <w:instrText xml:space="preserve"> PAGEREF _Toc219644131 \h </w:instrText>
             </w:r>
             <w:r>
               <w:rPr>
@@ -700,7 +700,7 @@
               <w:lang w:eastAsia="ru-RU"/>
             </w:rPr>
           </w:pPr>
-          <w:hyperlink w:anchor="_Toc205324070" w:history="1">
+          <w:hyperlink w:anchor="_Toc219644132" w:history="1">
             <w:r>
               <w:rPr>
                 <w:rStyle w:val="a4"/>
@@ -728,7 +728,7 @@
                 <w:noProof/>
                 <w:webHidden/>
               </w:rPr>
-              <w:instrText xml:space="preserve"> PAGEREF _Toc205324070 \h </w:instrText>
+              <w:instrText xml:space="preserve"> PAGEREF _Toc219644132 \h </w:instrText>
             </w:r>
             <w:r>
               <w:rPr>
@@ -771,7 +771,7 @@
               <w:lang w:eastAsia="ru-RU"/>
             </w:rPr>
           </w:pPr>
-          <w:hyperlink w:anchor="_Toc205324071" w:history="1">
+          <w:hyperlink w:anchor="_Toc219644133" w:history="1">
             <w:r>
               <w:rPr>
                 <w:rStyle w:val="a4"/>
@@ -799,7 +799,7 @@
                 <w:noProof/>
                 <w:webHidden/>
               </w:rPr>
-              <w:instrText xml:space="preserve"> PAGEREF _Toc205324071 \h </w:instrText>
+              <w:instrText xml:space="preserve"> PAGEREF _Toc219644133 \h </w:instrText>
             </w:r>
             <w:r>
               <w:rPr>
@@ -842,12 +842,82 @@
               <w:lang w:eastAsia="ru-RU"/>
             </w:rPr>
           </w:pPr>
-          <w:hyperlink w:anchor="_Toc205324072" w:history="1">
+          <w:hyperlink w:anchor="_Toc219644134" w:history="1">
             <w:r>
               <w:rPr>
                 <w:rStyle w:val="a4"/>
                 <w:noProof/>
               </w:rPr>
+              <w:t>Об Способностях</w:t>
+            </w:r>
+            <w:r>
+              <w:rPr>
+                <w:noProof/>
+                <w:webHidden/>
+              </w:rPr>
+              <w:tab/>
+            </w:r>
+            <w:r>
+              <w:rPr>
+                <w:noProof/>
+                <w:webHidden/>
+              </w:rPr>
+              <w:fldChar w:fldCharType="begin"/>
+            </w:r>
+            <w:r>
+              <w:rPr>
+                <w:noProof/>
+                <w:webHidden/>
+              </w:rPr>
+              <w:instrText xml:space="preserve"> PAGEREF _Toc219644134 \h </w:instrText>
+            </w:r>
+            <w:r>
+              <w:rPr>
+                <w:noProof/>
+                <w:webHidden/>
+              </w:rPr>
+            </w:r>
+            <w:r>
+              <w:rPr>
+                <w:noProof/>
+                <w:webHidden/>
+              </w:rPr>
+              <w:fldChar w:fldCharType="separate"/>
+            </w:r>
+            <w:r>
+              <w:rPr>
+                <w:noProof/>
+                <w:webHidden/>
+              </w:rPr>
+              <w:t>5</w:t>
+            </w:r>
+            <w:r>
+              <w:rPr>
+                <w:noProof/>
+                <w:webHidden/>
+              </w:rPr>
+              <w:fldChar w:fldCharType="end"/>
+            </w:r>
+          </w:hyperlink>
+        </w:p>
+        <w:p>
+          <w:pPr>
+            <w:pStyle w:val="21"/>
+            <w:tabs>
+              <w:tab w:val="right" w:leader="dot" w:pos="9345"/>
+            </w:tabs>
+            <w:rPr>
+              <w:rFonts w:eastAsiaTheme="minorEastAsia"/>
+              <w:noProof/>
+              <w:lang w:eastAsia="ru-RU"/>
+            </w:rPr>
+          </w:pPr>
+          <w:hyperlink w:anchor="_Toc219644135" w:history="1">
+            <w:r>
+              <w:rPr>
+                <w:rStyle w:val="a4"/>
+                <w:noProof/>
+              </w:rPr>
               <w:t>Остальная структура данных</w:t>
             </w:r>
             <w:r>
@@ -869,7 +939,7 @@
                 <w:noProof/>
                 <w:webHidden/>
               </w:rPr>
-              <w:instrText xml:space="preserve"> PAGEREF _Toc205324072 \h </w:instrText>
+              <w:instrText xml:space="preserve"> PAGEREF _Toc219644135 \h </w:instrText>
             </w:r>
             <w:r>
               <w:rPr>
@@ -912,31 +982,13 @@
               <w:lang w:eastAsia="ru-RU"/>
             </w:rPr>
           </w:pPr>
-          <w:hyperlink w:anchor="_Toc205324073" w:history="1">
+          <w:hyperlink w:anchor="_Toc219644136" w:history="1">
             <w:r>
               <w:rPr>
                 <w:rStyle w:val="a4"/>
-                <w:rFonts w:cstheme="majorHAnsi"/>
-                <w:noProof/>
-              </w:rPr>
-              <w:t>Основные положения мастеров (</w:t>
-            </w:r>
-            <w:r>
-              <w:rPr>
-                <w:rStyle w:val="a4"/>
-                <w:rFonts w:cstheme="majorHAnsi"/>
-                <w:noProof/>
-                <w:lang w:val="en-CA"/>
-              </w:rPr>
-              <w:t>Wizards</w:t>
-            </w:r>
-            <w:r>
-              <w:rPr>
-                <w:rStyle w:val="a4"/>
-                <w:rFonts w:cstheme="majorHAnsi"/>
-                <w:noProof/>
-              </w:rPr>
-              <w:t>)</w:t>
+                <w:noProof/>
+              </w:rPr>
+              <w:t>Файловая структура</w:t>
             </w:r>
             <w:r>
               <w:rPr>
@@ -957,7 +1009,7 @@
                 <w:noProof/>
                 <w:webHidden/>
               </w:rPr>
-              <w:instrText xml:space="preserve"> PAGEREF _Toc205324073 \h </w:instrText>
+              <w:instrText xml:space="preserve"> PAGEREF _Toc219644136 \h </w:instrText>
             </w:r>
             <w:r>
               <w:rPr>
@@ -1000,13 +1052,28 @@
               <w:lang w:eastAsia="ru-RU"/>
             </w:rPr>
           </w:pPr>
-          <w:hyperlink w:anchor="_Toc205324074" w:history="1">
+          <w:hyperlink w:anchor="_Toc219644137" w:history="1">
             <w:r>
               <w:rPr>
                 <w:rStyle w:val="a4"/>
                 <w:noProof/>
               </w:rPr>
-              <w:t>Общее</w:t>
+              <w:t>Игровые данные (</w:t>
+            </w:r>
+            <w:r>
+              <w:rPr>
+                <w:rStyle w:val="a4"/>
+                <w:noProof/>
+                <w:lang w:val="en-US"/>
+              </w:rPr>
+              <w:t>GameData</w:t>
+            </w:r>
+            <w:r>
+              <w:rPr>
+                <w:rStyle w:val="a4"/>
+                <w:noProof/>
+              </w:rPr>
+              <w:t>)</w:t>
             </w:r>
             <w:r>
               <w:rPr>
@@ -1027,7 +1094,7 @@
                 <w:noProof/>
                 <w:webHidden/>
               </w:rPr>
-              <w:instrText xml:space="preserve"> PAGEREF _Toc205324074 \h </w:instrText>
+              <w:instrText xml:space="preserve"> PAGEREF _Toc219644137 \h </w:instrText>
             </w:r>
             <w:r>
               <w:rPr>
@@ -1070,13 +1137,31 @@
               <w:lang w:eastAsia="ru-RU"/>
             </w:rPr>
           </w:pPr>
-          <w:hyperlink w:anchor="_Toc205324075" w:history="1">
+          <w:hyperlink w:anchor="_Toc219644138" w:history="1">
             <w:r>
               <w:rPr>
                 <w:rStyle w:val="a4"/>
-                <w:noProof/>
-              </w:rPr>
-              <w:t>Структура игровых данных</w:t>
+                <w:rFonts w:cstheme="majorHAnsi"/>
+                <w:noProof/>
+              </w:rPr>
+              <w:t>Основные положения мастеров (</w:t>
+            </w:r>
+            <w:r>
+              <w:rPr>
+                <w:rStyle w:val="a4"/>
+                <w:rFonts w:cstheme="majorHAnsi"/>
+                <w:noProof/>
+                <w:lang w:val="en-CA"/>
+              </w:rPr>
+              <w:t>Wizards</w:t>
+            </w:r>
+            <w:r>
+              <w:rPr>
+                <w:rStyle w:val="a4"/>
+                <w:rFonts w:cstheme="majorHAnsi"/>
+                <w:noProof/>
+              </w:rPr>
+              <w:t>)</w:t>
             </w:r>
             <w:r>
               <w:rPr>
@@ -1097,7 +1182,7 @@
                 <w:noProof/>
                 <w:webHidden/>
               </w:rPr>
-              <w:instrText xml:space="preserve"> PAGEREF _Toc205324075 \h </w:instrText>
+              <w:instrText xml:space="preserve"> PAGEREF _Toc219644138 \h </w:instrText>
             </w:r>
             <w:r>
               <w:rPr>
@@ -1140,13 +1225,13 @@
               <w:lang w:eastAsia="ru-RU"/>
             </w:rPr>
           </w:pPr>
-          <w:hyperlink w:anchor="_Toc205324076" w:history="1">
+          <w:hyperlink w:anchor="_Toc219644139" w:history="1">
             <w:r>
               <w:rPr>
                 <w:rStyle w:val="a4"/>
                 <w:noProof/>
               </w:rPr>
-              <w:t>Единицы</w:t>
+              <w:t>Общее</w:t>
             </w:r>
             <w:r>
               <w:rPr>
@@ -1167,7 +1252,7 @@
                 <w:noProof/>
                 <w:webHidden/>
               </w:rPr>
-              <w:instrText xml:space="preserve"> PAGEREF _Toc205324076 \h </w:instrText>
+              <w:instrText xml:space="preserve"> PAGEREF _Toc219644139 \h </w:instrText>
             </w:r>
             <w:r>
               <w:rPr>
@@ -1188,6 +1273,76 @@
                 <w:webHidden/>
               </w:rPr>
               <w:t>7</w:t>
+            </w:r>
+            <w:r>
+              <w:rPr>
+                <w:noProof/>
+                <w:webHidden/>
+              </w:rPr>
+              <w:fldChar w:fldCharType="end"/>
+            </w:r>
+          </w:hyperlink>
+        </w:p>
+        <w:p>
+          <w:pPr>
+            <w:pStyle w:val="11"/>
+            <w:tabs>
+              <w:tab w:val="right" w:leader="dot" w:pos="9345"/>
+            </w:tabs>
+            <w:rPr>
+              <w:rFonts w:eastAsiaTheme="minorEastAsia"/>
+              <w:noProof/>
+              <w:lang w:eastAsia="ru-RU"/>
+            </w:rPr>
+          </w:pPr>
+          <w:hyperlink w:anchor="_Toc219644140" w:history="1">
+            <w:r>
+              <w:rPr>
+                <w:rStyle w:val="a4"/>
+                <w:noProof/>
+              </w:rPr>
+              <w:t>Структура игровых данных</w:t>
+            </w:r>
+            <w:r>
+              <w:rPr>
+                <w:noProof/>
+                <w:webHidden/>
+              </w:rPr>
+              <w:tab/>
+            </w:r>
+            <w:r>
+              <w:rPr>
+                <w:noProof/>
+                <w:webHidden/>
+              </w:rPr>
+              <w:fldChar w:fldCharType="begin"/>
+            </w:r>
+            <w:r>
+              <w:rPr>
+                <w:noProof/>
+                <w:webHidden/>
+              </w:rPr>
+              <w:instrText xml:space="preserve"> PAGEREF _Toc219644140 \h </w:instrText>
+            </w:r>
+            <w:r>
+              <w:rPr>
+                <w:noProof/>
+                <w:webHidden/>
+              </w:rPr>
+            </w:r>
+            <w:r>
+              <w:rPr>
+                <w:noProof/>
+                <w:webHidden/>
+              </w:rPr>
+              <w:fldChar w:fldCharType="separate"/>
+            </w:r>
+            <w:r>
+              <w:rPr>
+                <w:noProof/>
+                <w:webHidden/>
+              </w:rPr>
+              <w:t>8</w:t>
             </w:r>
             <w:r>
               <w:rPr>
@@ -1210,13 +1365,13 @@
               <w:lang w:eastAsia="ru-RU"/>
             </w:rPr>
           </w:pPr>
-          <w:hyperlink w:anchor="_Toc205324077" w:history="1">
+          <w:hyperlink w:anchor="_Toc219644141" w:history="1">
             <w:r>
               <w:rPr>
                 <w:rStyle w:val="a4"/>
                 <w:noProof/>
               </w:rPr>
-              <w:t>Способности</w:t>
+              <w:t>Единицы</w:t>
             </w:r>
             <w:r>
               <w:rPr>
@@ -1237,7 +1392,7 @@
                 <w:noProof/>
                 <w:webHidden/>
               </w:rPr>
-              <w:instrText xml:space="preserve"> PAGEREF _Toc205324077 \h </w:instrText>
+              <w:instrText xml:space="preserve"> PAGEREF _Toc219644141 \h </w:instrText>
             </w:r>
             <w:r>
               <w:rPr>
@@ -1257,7 +1412,7 @@
                 <w:noProof/>
                 <w:webHidden/>
               </w:rPr>
-              <w:t>7</w:t>
+              <w:t>8</w:t>
             </w:r>
             <w:r>
               <w:rPr>
@@ -1280,12 +1435,82 @@
               <w:lang w:eastAsia="ru-RU"/>
             </w:rPr>
           </w:pPr>
-          <w:hyperlink w:anchor="_Toc205324078" w:history="1">
+          <w:hyperlink w:anchor="_Toc219644142" w:history="1">
             <w:r>
               <w:rPr>
                 <w:rStyle w:val="a4"/>
                 <w:noProof/>
               </w:rPr>
+              <w:t>Способности</w:t>
+            </w:r>
+            <w:r>
+              <w:rPr>
+                <w:noProof/>
+                <w:webHidden/>
+              </w:rPr>
+              <w:tab/>
+            </w:r>
+            <w:r>
+              <w:rPr>
+                <w:noProof/>
+                <w:webHidden/>
+              </w:rPr>
+              <w:fldChar w:fldCharType="begin"/>
+            </w:r>
+            <w:r>
+              <w:rPr>
+                <w:noProof/>
+                <w:webHidden/>
+              </w:rPr>
+              <w:instrText xml:space="preserve"> PAGEREF _Toc219644142 \h </w:instrText>
+            </w:r>
+            <w:r>
+              <w:rPr>
+                <w:noProof/>
+                <w:webHidden/>
+              </w:rPr>
+            </w:r>
+            <w:r>
+              <w:rPr>
+                <w:noProof/>
+                <w:webHidden/>
+              </w:rPr>
+              <w:fldChar w:fldCharType="separate"/>
+            </w:r>
+            <w:r>
+              <w:rPr>
+                <w:noProof/>
+                <w:webHidden/>
+              </w:rPr>
+              <w:t>8</w:t>
+            </w:r>
+            <w:r>
+              <w:rPr>
+                <w:noProof/>
+                <w:webHidden/>
+              </w:rPr>
+              <w:fldChar w:fldCharType="end"/>
+            </w:r>
+          </w:hyperlink>
+        </w:p>
+        <w:p>
+          <w:pPr>
+            <w:pStyle w:val="21"/>
+            <w:tabs>
+              <w:tab w:val="right" w:leader="dot" w:pos="9345"/>
+            </w:tabs>
+            <w:rPr>
+              <w:rFonts w:eastAsiaTheme="minorEastAsia"/>
+              <w:noProof/>
+              <w:lang w:eastAsia="ru-RU"/>
+            </w:rPr>
+          </w:pPr>
+          <w:hyperlink w:anchor="_Toc219644143" w:history="1">
+            <w:r>
+              <w:rPr>
+                <w:rStyle w:val="a4"/>
+                <w:noProof/>
+              </w:rPr>
               <w:t>Оружия</w:t>
             </w:r>
             <w:r>
@@ -1307,7 +1532,7 @@
                 <w:noProof/>
                 <w:webHidden/>
               </w:rPr>
-              <w:instrText xml:space="preserve"> PAGEREF _Toc205324078 \h </w:instrText>
+              <w:instrText xml:space="preserve"> PAGEREF _Toc219644143 \h </w:instrText>
             </w:r>
             <w:r>
               <w:rPr>
@@ -1327,7 +1552,7 @@
                 <w:noProof/>
                 <w:webHidden/>
               </w:rPr>
-              <w:t>7</w:t>
+              <w:t>8</w:t>
             </w:r>
             <w:r>
               <w:rPr>
@@ -1390,7 +1615,7 @@
           <w:rFonts w:cstheme="majorHAnsi"/>
         </w:rPr>
       </w:pPr>
-      <w:bookmarkStart w:id="0" w:name="_Toc205324063"/>
+      <w:bookmarkStart w:id="0" w:name="_Toc219644125"/>
       <w:r>
         <w:rPr>
           <w:rFonts w:cstheme="majorHAnsi"/>
@@ -1621,12 +1846,14 @@
         </w:rPr>
         <w:t xml:space="preserve">, </w:t>
       </w:r>
+      <w:proofErr w:type="spellStart"/>
       <w:r>
         <w:rPr>
           <w:rFonts w:asciiTheme="majorHAnsi" w:hAnsiTheme="majorHAnsi" w:cstheme="majorHAnsi"/>
         </w:rPr>
         <w:t>катсцен</w:t>
       </w:r>
+      <w:proofErr w:type="spellEnd"/>
       <w:r>
         <w:rPr>
           <w:rFonts w:asciiTheme="majorHAnsi" w:hAnsiTheme="majorHAnsi" w:cstheme="majorHAnsi"/>
@@ -1656,6 +1883,356 @@
           <w:rFonts w:asciiTheme="majorHAnsi" w:hAnsiTheme="majorHAnsi" w:cstheme="majorHAnsi"/>
         </w:rPr>
         <w:t xml:space="preserve">. </w:t>
+      </w:r>
+    </w:p>
+    <w:p>
+      <w:pPr>
+        <w:rPr>
+          <w:rFonts w:asciiTheme="majorHAnsi" w:hAnsiTheme="majorHAnsi" w:cstheme="majorHAnsi"/>
+        </w:rPr>
+      </w:pPr>
+      <w:r>
+        <w:rPr>
+          <w:rFonts w:asciiTheme="majorHAnsi" w:hAnsiTheme="majorHAnsi" w:cstheme="majorHAnsi"/>
+          <w:b/>
+          <w:bCs/>
+        </w:rPr>
+        <w:t>Коллекция данных</w:t>
+      </w:r>
+      <w:r>
+        <w:rPr>
+          <w:rFonts w:asciiTheme="majorHAnsi" w:hAnsiTheme="majorHAnsi" w:cstheme="majorHAnsi"/>
+        </w:rPr>
+        <w:t xml:space="preserve"> (на англ</w:t>
+      </w:r>
+      <w:r>
+        <w:rPr>
+          <w:rFonts w:asciiTheme="majorHAnsi" w:hAnsiTheme="majorHAnsi" w:cstheme="majorHAnsi"/>
+        </w:rPr>
+        <w:t>. “</w:t>
+      </w:r>
+      <w:r>
+        <w:rPr>
+          <w:rFonts w:asciiTheme="majorHAnsi" w:hAnsiTheme="majorHAnsi" w:cstheme="majorHAnsi"/>
+          <w:lang w:val="en-US"/>
+        </w:rPr>
+        <w:t>Data</w:t>
+      </w:r>
+      <w:r>
+        <w:rPr>
+          <w:rFonts w:asciiTheme="majorHAnsi" w:hAnsiTheme="majorHAnsi" w:cstheme="majorHAnsi"/>
+        </w:rPr>
+        <w:t xml:space="preserve"> </w:t>
+      </w:r>
+      <w:r>
+        <w:rPr>
+          <w:rFonts w:asciiTheme="majorHAnsi" w:hAnsiTheme="majorHAnsi" w:cstheme="majorHAnsi"/>
+          <w:lang w:val="en-US"/>
+        </w:rPr>
+        <w:t>Collection</w:t>
+      </w:r>
+      <w:r>
+        <w:rPr>
+          <w:rFonts w:asciiTheme="majorHAnsi" w:hAnsiTheme="majorHAnsi" w:cstheme="majorHAnsi"/>
+        </w:rPr>
+        <w:t xml:space="preserve">”) – </w:t>
+      </w:r>
+      <w:r>
+        <w:rPr>
+          <w:rFonts w:asciiTheme="majorHAnsi" w:hAnsiTheme="majorHAnsi" w:cstheme="majorHAnsi"/>
+        </w:rPr>
+        <w:t>Тип</w:t>
+      </w:r>
+      <w:r>
+        <w:rPr>
+          <w:rFonts w:asciiTheme="majorHAnsi" w:hAnsiTheme="majorHAnsi" w:cstheme="majorHAnsi"/>
+        </w:rPr>
+        <w:t xml:space="preserve"> </w:t>
+      </w:r>
+      <w:r>
+        <w:rPr>
+          <w:rFonts w:asciiTheme="majorHAnsi" w:hAnsiTheme="majorHAnsi" w:cstheme="majorHAnsi"/>
+        </w:rPr>
+        <w:t>объекта</w:t>
+      </w:r>
+      <w:r>
+        <w:rPr>
+          <w:rFonts w:asciiTheme="majorHAnsi" w:hAnsiTheme="majorHAnsi" w:cstheme="majorHAnsi"/>
+        </w:rPr>
+        <w:t xml:space="preserve"> </w:t>
+      </w:r>
+      <w:r>
+        <w:rPr>
+          <w:rFonts w:asciiTheme="majorHAnsi" w:hAnsiTheme="majorHAnsi" w:cstheme="majorHAnsi"/>
+        </w:rPr>
+        <w:t xml:space="preserve">данных в каталоге игры </w:t>
+      </w:r>
+      <w:proofErr w:type="spellStart"/>
+      <w:r>
+        <w:rPr>
+          <w:rFonts w:asciiTheme="majorHAnsi" w:hAnsiTheme="majorHAnsi" w:cstheme="majorHAnsi"/>
+          <w:i/>
+          <w:iCs/>
+          <w:lang w:val="en-US"/>
+        </w:rPr>
+        <w:t>DataCollectionData</w:t>
+      </w:r>
+      <w:proofErr w:type="spellEnd"/>
+      <w:r>
+        <w:rPr>
+          <w:rFonts w:asciiTheme="majorHAnsi" w:hAnsiTheme="majorHAnsi" w:cstheme="majorHAnsi"/>
+        </w:rPr>
+        <w:t xml:space="preserve">, </w:t>
+      </w:r>
+      <w:r>
+        <w:rPr>
+          <w:rFonts w:asciiTheme="majorHAnsi" w:hAnsiTheme="majorHAnsi" w:cstheme="majorHAnsi"/>
+        </w:rPr>
+        <w:t xml:space="preserve">являющийся таким же объектом как </w:t>
+      </w:r>
+      <w:r>
+        <w:rPr>
+          <w:rFonts w:asciiTheme="majorHAnsi" w:hAnsiTheme="majorHAnsi" w:cstheme="majorHAnsi"/>
+          <w:i/>
+          <w:iCs/>
+        </w:rPr>
+        <w:t>единица</w:t>
+      </w:r>
+      <w:r>
+        <w:rPr>
+          <w:rFonts w:asciiTheme="majorHAnsi" w:hAnsiTheme="majorHAnsi" w:cstheme="majorHAnsi"/>
+          <w:i/>
+          <w:iCs/>
+        </w:rPr>
+        <w:t xml:space="preserve">, </w:t>
+      </w:r>
+      <w:r>
+        <w:rPr>
+          <w:rFonts w:asciiTheme="majorHAnsi" w:hAnsiTheme="majorHAnsi" w:cstheme="majorHAnsi"/>
+          <w:i/>
+          <w:iCs/>
+        </w:rPr>
+        <w:t>способность</w:t>
+      </w:r>
+      <w:r>
+        <w:rPr>
+          <w:rFonts w:asciiTheme="majorHAnsi" w:hAnsiTheme="majorHAnsi" w:cstheme="majorHAnsi"/>
+          <w:i/>
+          <w:iCs/>
+        </w:rPr>
+        <w:t xml:space="preserve">, </w:t>
+      </w:r>
+      <w:r>
+        <w:rPr>
+          <w:rFonts w:asciiTheme="majorHAnsi" w:hAnsiTheme="majorHAnsi" w:cstheme="majorHAnsi"/>
+          <w:i/>
+          <w:iCs/>
+        </w:rPr>
+        <w:t>оружие</w:t>
+      </w:r>
+      <w:r>
+        <w:rPr>
+          <w:rFonts w:asciiTheme="majorHAnsi" w:hAnsiTheme="majorHAnsi" w:cstheme="majorHAnsi"/>
+          <w:i/>
+          <w:iCs/>
+        </w:rPr>
+        <w:t xml:space="preserve">, </w:t>
+      </w:r>
+      <w:r>
+        <w:rPr>
+          <w:rFonts w:asciiTheme="majorHAnsi" w:hAnsiTheme="majorHAnsi" w:cstheme="majorHAnsi"/>
+          <w:i/>
+          <w:iCs/>
+        </w:rPr>
+        <w:t>эффект и далее</w:t>
+      </w:r>
+      <w:r>
+        <w:rPr>
+          <w:rFonts w:asciiTheme="majorHAnsi" w:hAnsiTheme="majorHAnsi" w:cstheme="majorHAnsi"/>
+        </w:rPr>
+        <w:t xml:space="preserve">, </w:t>
+      </w:r>
+      <w:r>
+        <w:rPr>
+          <w:rFonts w:asciiTheme="majorHAnsi" w:hAnsiTheme="majorHAnsi" w:cstheme="majorHAnsi"/>
+        </w:rPr>
+        <w:t>но предназначенный для группировки всех остальных объектов</w:t>
+      </w:r>
+    </w:p>
+    <w:p>
+      <w:pPr>
+        <w:rPr>
+          <w:rFonts w:asciiTheme="majorHAnsi" w:hAnsiTheme="majorHAnsi" w:cstheme="majorHAnsi"/>
+        </w:rPr>
+      </w:pPr>
+      <w:r>
+        <w:rPr>
+          <w:rFonts w:asciiTheme="majorHAnsi" w:hAnsiTheme="majorHAnsi" w:cstheme="majorHAnsi"/>
+          <w:b/>
+          <w:bCs/>
+        </w:rPr>
+        <w:t>Пространство данных</w:t>
+      </w:r>
+      <w:r>
+        <w:rPr>
+          <w:rFonts w:asciiTheme="majorHAnsi" w:hAnsiTheme="majorHAnsi" w:cstheme="majorHAnsi"/>
+        </w:rPr>
+        <w:t xml:space="preserve"> (на англ</w:t>
+      </w:r>
+      <w:r>
+        <w:rPr>
+          <w:rFonts w:asciiTheme="majorHAnsi" w:hAnsiTheme="majorHAnsi" w:cstheme="majorHAnsi"/>
+        </w:rPr>
+        <w:t>. “</w:t>
+      </w:r>
+      <w:r>
+        <w:rPr>
+          <w:rFonts w:asciiTheme="majorHAnsi" w:hAnsiTheme="majorHAnsi" w:cstheme="majorHAnsi"/>
+          <w:lang w:val="en-US"/>
+        </w:rPr>
+        <w:t>Data</w:t>
+      </w:r>
+      <w:r>
+        <w:rPr>
+          <w:rFonts w:asciiTheme="majorHAnsi" w:hAnsiTheme="majorHAnsi" w:cstheme="majorHAnsi"/>
+        </w:rPr>
+        <w:t xml:space="preserve"> </w:t>
+      </w:r>
+      <w:r>
+        <w:rPr>
+          <w:rFonts w:asciiTheme="majorHAnsi" w:hAnsiTheme="majorHAnsi" w:cstheme="majorHAnsi"/>
+          <w:lang w:val="en-US"/>
+        </w:rPr>
+        <w:t>space</w:t>
+      </w:r>
+      <w:r>
+        <w:rPr>
+          <w:rFonts w:asciiTheme="majorHAnsi" w:hAnsiTheme="majorHAnsi" w:cstheme="majorHAnsi"/>
+        </w:rPr>
+        <w:t>”</w:t>
+      </w:r>
+      <w:r>
+        <w:rPr>
+          <w:rFonts w:asciiTheme="majorHAnsi" w:hAnsiTheme="majorHAnsi" w:cstheme="majorHAnsi"/>
+        </w:rPr>
+        <w:t>)</w:t>
+      </w:r>
+      <w:r>
+        <w:rPr>
+          <w:rFonts w:asciiTheme="majorHAnsi" w:hAnsiTheme="majorHAnsi" w:cstheme="majorHAnsi"/>
+        </w:rPr>
+        <w:t xml:space="preserve"> – </w:t>
+      </w:r>
+      <w:r>
+        <w:rPr>
+          <w:rFonts w:asciiTheme="majorHAnsi" w:hAnsiTheme="majorHAnsi" w:cstheme="majorHAnsi"/>
+        </w:rPr>
+        <w:t xml:space="preserve">физический файл данных </w:t>
+      </w:r>
+      <w:r>
+        <w:rPr>
+          <w:rFonts w:asciiTheme="majorHAnsi" w:hAnsiTheme="majorHAnsi" w:cstheme="majorHAnsi"/>
+          <w:i/>
+          <w:iCs/>
+        </w:rPr>
+        <w:t>.</w:t>
+      </w:r>
+      <w:r>
+        <w:rPr>
+          <w:rFonts w:asciiTheme="majorHAnsi" w:hAnsiTheme="majorHAnsi" w:cstheme="majorHAnsi"/>
+          <w:i/>
+          <w:iCs/>
+          <w:lang w:val="en-US"/>
+        </w:rPr>
+        <w:t>xml</w:t>
+      </w:r>
+      <w:r>
+        <w:rPr>
+          <w:rFonts w:asciiTheme="majorHAnsi" w:hAnsiTheme="majorHAnsi" w:cstheme="majorHAnsi"/>
+        </w:rPr>
+        <w:t xml:space="preserve">, </w:t>
+      </w:r>
+      <w:r>
+        <w:rPr>
+          <w:rFonts w:asciiTheme="majorHAnsi" w:hAnsiTheme="majorHAnsi" w:cstheme="majorHAnsi"/>
+        </w:rPr>
+        <w:t>содержащий полный набор взаимосвязанных единиц данных (единица</w:t>
+      </w:r>
+      <w:r>
+        <w:rPr>
+          <w:rFonts w:asciiTheme="majorHAnsi" w:hAnsiTheme="majorHAnsi" w:cstheme="majorHAnsi"/>
+        </w:rPr>
+        <w:t xml:space="preserve">, </w:t>
+      </w:r>
+      <w:r>
+        <w:rPr>
+          <w:rFonts w:asciiTheme="majorHAnsi" w:hAnsiTheme="majorHAnsi" w:cstheme="majorHAnsi"/>
+        </w:rPr>
+        <w:t>её способности</w:t>
+      </w:r>
+      <w:r>
+        <w:rPr>
+          <w:rFonts w:asciiTheme="majorHAnsi" w:hAnsiTheme="majorHAnsi" w:cstheme="majorHAnsi"/>
+        </w:rPr>
+        <w:t xml:space="preserve">, </w:t>
+      </w:r>
+      <w:r>
+        <w:rPr>
+          <w:rFonts w:asciiTheme="majorHAnsi" w:hAnsiTheme="majorHAnsi" w:cstheme="majorHAnsi"/>
+        </w:rPr>
+        <w:t>её оружия)</w:t>
+      </w:r>
+      <w:r>
+        <w:rPr>
+          <w:rFonts w:asciiTheme="majorHAnsi" w:hAnsiTheme="majorHAnsi" w:cstheme="majorHAnsi"/>
+        </w:rPr>
+        <w:t xml:space="preserve">. </w:t>
+      </w:r>
+      <w:r>
+        <w:rPr>
+          <w:rFonts w:asciiTheme="majorHAnsi" w:hAnsiTheme="majorHAnsi" w:cstheme="majorHAnsi"/>
+        </w:rPr>
+        <w:t>В таких пространствах данных</w:t>
+      </w:r>
+      <w:r>
+        <w:rPr>
+          <w:rFonts w:asciiTheme="majorHAnsi" w:hAnsiTheme="majorHAnsi" w:cstheme="majorHAnsi"/>
+        </w:rPr>
+        <w:t xml:space="preserve">, </w:t>
+      </w:r>
+      <w:r>
+        <w:rPr>
+          <w:rFonts w:asciiTheme="majorHAnsi" w:hAnsiTheme="majorHAnsi" w:cstheme="majorHAnsi"/>
+        </w:rPr>
+        <w:t xml:space="preserve">допускаются ссылки на сторонние </w:t>
+      </w:r>
+      <w:r>
+        <w:rPr>
+          <w:rFonts w:asciiTheme="majorHAnsi" w:hAnsiTheme="majorHAnsi" w:cstheme="majorHAnsi"/>
+          <w:b/>
+          <w:bCs/>
+        </w:rPr>
+        <w:t>единицы</w:t>
+      </w:r>
+      <w:r>
+        <w:rPr>
+          <w:rFonts w:asciiTheme="majorHAnsi" w:hAnsiTheme="majorHAnsi" w:cstheme="majorHAnsi"/>
+        </w:rPr>
+        <w:t xml:space="preserve"> </w:t>
+      </w:r>
+      <w:r>
+        <w:rPr>
+          <w:rFonts w:asciiTheme="majorHAnsi" w:hAnsiTheme="majorHAnsi" w:cstheme="majorHAnsi"/>
+          <w:b/>
+          <w:bCs/>
+        </w:rPr>
+        <w:t>данных</w:t>
+      </w:r>
+      <w:r>
+        <w:rPr>
+          <w:rFonts w:asciiTheme="majorHAnsi" w:hAnsiTheme="majorHAnsi" w:cstheme="majorHAnsi"/>
+        </w:rPr>
+        <w:t xml:space="preserve"> одного командира</w:t>
       </w:r>
     </w:p>
     <w:p>
@@ -1676,7 +2253,7 @@
         <w:pStyle w:val="1"/>
         <w:jc w:val="center"/>
       </w:pPr>
-      <w:bookmarkStart w:id="2" w:name="_Toc205324064"/>
+      <w:bookmarkStart w:id="2" w:name="_Toc219644126"/>
       <w:r>
         <w:lastRenderedPageBreak/>
         <w:t>Организация работы</w:t>
@@ -1723,7 +2300,7 @@
       <w:pPr>
         <w:pStyle w:val="2"/>
       </w:pPr>
-      <w:bookmarkStart w:id="3" w:name="_Toc205324065"/>
+      <w:bookmarkStart w:id="3" w:name="_Toc219644127"/>
       <w:r>
         <w:t>Разработка командиров</w:t>
       </w:r>
@@ -1835,7 +2412,7 @@
       <w:pPr>
         <w:pStyle w:val="2"/>
       </w:pPr>
-      <w:bookmarkStart w:id="4" w:name="_Toc205324066"/>
+      <w:bookmarkStart w:id="4" w:name="_Toc219644128"/>
       <w:r>
         <w:t xml:space="preserve">Ведение </w:t>
       </w:r>
@@ -1969,7 +2546,7 @@
           <w:rFonts w:cstheme="majorHAnsi"/>
         </w:rPr>
       </w:pPr>
-      <w:bookmarkStart w:id="5" w:name="_Toc205324067"/>
+      <w:bookmarkStart w:id="5" w:name="_Toc219644129"/>
       <w:r>
         <w:rPr>
           <w:rFonts w:cstheme="majorHAnsi"/>
@@ -2015,7 +2592,7 @@
           <w:szCs w:val="28"/>
         </w:rPr>
       </w:pPr>
-      <w:bookmarkStart w:id="6" w:name="_Toc205324068"/>
+      <w:bookmarkStart w:id="6" w:name="_Toc219644130"/>
       <w:r>
         <w:rPr>
           <w:rFonts w:cstheme="majorHAnsi"/>
@@ -2175,6 +2752,7 @@
         </w:rPr>
         <w:t>-{</w:t>
       </w:r>
+      <w:proofErr w:type="spellStart"/>
       <w:r>
         <w:rPr>
           <w:rFonts w:asciiTheme="majorHAnsi" w:hAnsiTheme="majorHAnsi" w:cstheme="majorHAnsi"/>
@@ -2182,6 +2760,7 @@
         </w:rPr>
         <w:t>NameCommander</w:t>
       </w:r>
+      <w:proofErr w:type="spellEnd"/>
       <w:r>
         <w:rPr>
           <w:rFonts w:asciiTheme="majorHAnsi" w:hAnsiTheme="majorHAnsi" w:cstheme="majorHAnsi"/>
@@ -2298,6 +2877,7 @@
         </w:rPr>
         <w:t>Каждая зависимая модификация командира, должна иметь только одну подключенную зависимость, такую как “</w:t>
       </w:r>
+      <w:proofErr w:type="spellStart"/>
       <w:r>
         <w:rPr>
           <w:rFonts w:asciiTheme="majorHAnsi" w:hAnsiTheme="majorHAnsi" w:cstheme="majorHAnsi"/>
@@ -2305,6 +2885,7 @@
         </w:rPr>
         <w:t>COOPCore</w:t>
       </w:r>
+      <w:proofErr w:type="spellEnd"/>
       <w:r>
         <w:rPr>
           <w:rFonts w:asciiTheme="majorHAnsi" w:hAnsiTheme="majorHAnsi" w:cstheme="majorHAnsi"/>
@@ -2359,7 +2940,7 @@
           <w:rFonts w:cstheme="majorHAnsi"/>
         </w:rPr>
       </w:pPr>
-      <w:bookmarkStart w:id="7" w:name="_Toc205324069"/>
+      <w:bookmarkStart w:id="7" w:name="_Toc219644131"/>
       <w:r>
         <w:rPr>
           <w:rFonts w:cstheme="majorHAnsi"/>
@@ -2545,7 +3126,7 @@
           <w:rFonts w:cstheme="majorHAnsi"/>
         </w:rPr>
       </w:pPr>
-      <w:bookmarkStart w:id="8" w:name="_Toc205324070"/>
+      <w:bookmarkStart w:id="8" w:name="_Toc219644132"/>
       <w:r>
         <w:rPr>
           <w:rFonts w:cstheme="majorHAnsi"/>
@@ -2678,7 +3259,21 @@
         <w:rPr>
           <w:rFonts w:asciiTheme="majorHAnsi" w:hAnsiTheme="majorHAnsi" w:cstheme="majorHAnsi"/>
         </w:rPr>
-        <w:t>. Это касается всех единиц данных, будь то единица, Актор, Модель, Звук, Набор данных и прочие</w:t>
+        <w:t xml:space="preserve">. Это касается всех единиц данных, будь то единица, </w:t>
+      </w:r>
+      <w:proofErr w:type="spellStart"/>
+      <w:r>
+        <w:rPr>
+          <w:rFonts w:asciiTheme="majorHAnsi" w:hAnsiTheme="majorHAnsi" w:cstheme="majorHAnsi"/>
+        </w:rPr>
+        <w:t>Актор</w:t>
+      </w:r>
+      <w:proofErr w:type="spellEnd"/>
+      <w:r>
+        <w:rPr>
+          <w:rFonts w:asciiTheme="majorHAnsi" w:hAnsiTheme="majorHAnsi" w:cstheme="majorHAnsi"/>
+        </w:rPr>
+        <w:t>, Модель, Звук, Набор данных и прочие</w:t>
       </w:r>
     </w:p>
     <w:p>
@@ -3011,7 +3606,55 @@
           <w:rFonts w:asciiTheme="majorHAnsi" w:hAnsiTheme="majorHAnsi" w:cstheme="majorHAnsi"/>
           <w:bdr w:val="none" w:sz="0" w:space="0" w:color="auto" w:frame="1"/>
         </w:rPr>
-        <w:t>необходимо использовать специальные категории редактора (COMMANDER - Raynor, COMMANDER - Kerrigan, COMMANDER - Artanis и т.д.). При создании новых данных, всегда выбирайте соответствующую категорию командира. Это значительно облегчит поиск данных, относящихся к конкретному командиру, а также позволит легко определить, какие данные требуют обновления при внесении изменений в геймплей соответствующего командира.</w:t>
+        <w:t xml:space="preserve">необходимо использовать специальные категории редактора (COMMANDER - </w:t>
+      </w:r>
+      <w:proofErr w:type="spellStart"/>
+      <w:r>
+        <w:rPr>
+          <w:rFonts w:asciiTheme="majorHAnsi" w:hAnsiTheme="majorHAnsi" w:cstheme="majorHAnsi"/>
+          <w:bdr w:val="none" w:sz="0" w:space="0" w:color="auto" w:frame="1"/>
+        </w:rPr>
+        <w:t>Raynor</w:t>
+      </w:r>
+      <w:proofErr w:type="spellEnd"/>
+      <w:r>
+        <w:rPr>
+          <w:rFonts w:asciiTheme="majorHAnsi" w:hAnsiTheme="majorHAnsi" w:cstheme="majorHAnsi"/>
+          <w:bdr w:val="none" w:sz="0" w:space="0" w:color="auto" w:frame="1"/>
+        </w:rPr>
+        <w:t xml:space="preserve">, COMMANDER - </w:t>
+      </w:r>
+      <w:proofErr w:type="spellStart"/>
+      <w:r>
+        <w:rPr>
+          <w:rFonts w:asciiTheme="majorHAnsi" w:hAnsiTheme="majorHAnsi" w:cstheme="majorHAnsi"/>
+          <w:bdr w:val="none" w:sz="0" w:space="0" w:color="auto" w:frame="1"/>
+        </w:rPr>
+        <w:t>Kerrigan</w:t>
+      </w:r>
+      <w:proofErr w:type="spellEnd"/>
+      <w:r>
+        <w:rPr>
+          <w:rFonts w:asciiTheme="majorHAnsi" w:hAnsiTheme="majorHAnsi" w:cstheme="majorHAnsi"/>
+          <w:bdr w:val="none" w:sz="0" w:space="0" w:color="auto" w:frame="1"/>
+        </w:rPr>
+        <w:t xml:space="preserve">, COMMANDER - </w:t>
+      </w:r>
+      <w:proofErr w:type="spellStart"/>
+      <w:r>
+        <w:rPr>
+          <w:rFonts w:asciiTheme="majorHAnsi" w:hAnsiTheme="majorHAnsi" w:cstheme="majorHAnsi"/>
+          <w:bdr w:val="none" w:sz="0" w:space="0" w:color="auto" w:frame="1"/>
+        </w:rPr>
+        <w:t>Artanis</w:t>
+      </w:r>
+      <w:proofErr w:type="spellEnd"/>
+      <w:r>
+        <w:rPr>
+          <w:rFonts w:asciiTheme="majorHAnsi" w:hAnsiTheme="majorHAnsi" w:cstheme="majorHAnsi"/>
+          <w:bdr w:val="none" w:sz="0" w:space="0" w:color="auto" w:frame="1"/>
+        </w:rPr>
+        <w:t xml:space="preserve"> и т.д.). При создании новых данных, всегда выбирайте соответствующую категорию командира. Это значительно облегчит поиск данных, относящихся к конкретному командиру, а также позволит легко определить, какие данные требуют обновления при внесении изменений в геймплей соответствующего командира.</w:t>
       </w:r>
     </w:p>
     <w:p>
@@ -3028,7 +3671,7 @@
           <w:rFonts w:cstheme="majorHAnsi"/>
         </w:rPr>
       </w:pPr>
-      <w:bookmarkStart w:id="9" w:name="_Toc205324071"/>
+      <w:bookmarkStart w:id="9" w:name="_Toc219644133"/>
       <w:r>
         <w:rPr>
           <w:rFonts w:cstheme="majorHAnsi"/>
@@ -3083,26 +3726,48 @@
           <w:bCs/>
           <w:lang w:val="en-CA"/>
         </w:rPr>
-        <w:t>&lt;d stringref=”Catalog,Entry,Field”/&gt;</w:t>
-      </w:r>
-    </w:p>
-    <w:p>
-      <w:pPr>
+        <w:t>&lt;d stringref</w:t>
+      </w:r>
+      <w:proofErr w:type="gramStart"/>
+      <w:r>
         <w:rPr>
           <w:rFonts w:asciiTheme="majorHAnsi" w:hAnsiTheme="majorHAnsi" w:cstheme="majorHAnsi"/>
           <w:b/>
           <w:bCs/>
           <w:lang w:val="en-CA"/>
         </w:rPr>
+        <w:t>=”Catalog</w:t>
+      </w:r>
+      <w:proofErr w:type="gramEnd"/>
+      <w:r>
+        <w:rPr>
+          <w:rFonts w:asciiTheme="majorHAnsi" w:hAnsiTheme="majorHAnsi" w:cstheme="majorHAnsi"/>
+          <w:b/>
+          <w:bCs/>
+          <w:lang w:val="en-CA"/>
+        </w:rPr>
+        <w:t>,Entry,Field”/&gt;</w:t>
+      </w:r>
+    </w:p>
+    <w:p>
+      <w:pPr>
+        <w:rPr>
+          <w:rFonts w:asciiTheme="majorHAnsi" w:hAnsiTheme="majorHAnsi" w:cstheme="majorHAnsi"/>
+          <w:b/>
+          <w:bCs/>
+          <w:lang w:val="en-CA"/>
+        </w:rPr>
       </w:pPr>
     </w:p>
     <w:p>
       <w:pPr>
         <w:pStyle w:val="2"/>
       </w:pPr>
+      <w:bookmarkStart w:id="10" w:name="_Toc219644134"/>
       <w:r>
         <w:t>Об Способностях</w:t>
       </w:r>
+      <w:bookmarkEnd w:id="10"/>
     </w:p>
     <w:p>
       <w:pPr>
@@ -3444,11 +4109,11 @@
       <w:pPr>
         <w:pStyle w:val="2"/>
       </w:pPr>
-      <w:bookmarkStart w:id="10" w:name="_Toc205324072"/>
+      <w:bookmarkStart w:id="11" w:name="_Toc219644135"/>
       <w:r>
         <w:t>Остальная структура данных</w:t>
       </w:r>
-      <w:bookmarkEnd w:id="10"/>
+      <w:bookmarkEnd w:id="11"/>
     </w:p>
     <w:p/>
     <w:p>
@@ -3502,6 +4167,9 @@
           <w:ilvl w:val="0"/>
           <w:numId w:val="7"/>
         </w:numPr>
+        <w:rPr>
+          <w:lang w:val="en-CA"/>
+        </w:rPr>
       </w:pPr>
       <w:r>
         <w:rPr>
@@ -3568,6 +4236,7 @@
       <w:r>
         <w:t xml:space="preserve">для командира </w:t>
       </w:r>
+      <w:proofErr w:type="spellStart"/>
       <w:r>
         <w:rPr>
           <w:b/>
@@ -3575,6 +4244,7 @@
         </w:rPr>
         <w:t>Рейнора</w:t>
       </w:r>
+      <w:proofErr w:type="spellEnd"/>
       <w:r>
         <w:rPr>
           <w:lang w:val="en-CA"/>
@@ -3592,6 +4262,7 @@
         </w:rPr>
         <w:t>“</w:t>
       </w:r>
+      <w:proofErr w:type="spellStart"/>
       <w:r>
         <w:rPr>
           <w:rFonts w:ascii="Courier New" w:hAnsi="Courier New" w:cs="Courier New"/>
@@ -3602,6 +4273,7 @@
         </w:rPr>
         <w:t>COOPRaynor</w:t>
       </w:r>
+      <w:proofErr w:type="spellEnd"/>
       <w:r>
         <w:rPr>
           <w:i/>
@@ -3616,19 +4288,500 @@
         </w:rPr>
         <w:t>.</w:t>
       </w:r>
-      <w:r>
-        <w:br w:type="page"/>
-      </w:r>
+    </w:p>
+    <w:p>
+      <w:pPr>
+        <w:pStyle w:val="a9"/>
+        <w:rPr>
+          <w:lang w:val="en-CA"/>
+        </w:rPr>
+      </w:pPr>
     </w:p>
     <w:p>
       <w:pPr>
         <w:pStyle w:val="1"/>
         <w:jc w:val="center"/>
+      </w:pPr>
+      <w:bookmarkStart w:id="12" w:name="_Toc219644136"/>
+      <w:r>
+        <w:lastRenderedPageBreak/>
+        <w:t>Файловая структура</w:t>
+      </w:r>
+      <w:bookmarkEnd w:id="12"/>
+    </w:p>
+    <w:p/>
+    <w:p>
+      <w:pPr>
+        <w:pStyle w:val="2"/>
+      </w:pPr>
+      <w:bookmarkStart w:id="13" w:name="_Toc219644137"/>
+      <w:r>
+        <w:t>Игровые данные (</w:t>
+      </w:r>
+      <w:proofErr w:type="spellStart"/>
+      <w:r>
+        <w:rPr>
+          <w:lang w:val="en-US"/>
+        </w:rPr>
+        <w:t>GameData</w:t>
+      </w:r>
+      <w:proofErr w:type="spellEnd"/>
+      <w:r>
+        <w:t>)</w:t>
+      </w:r>
+      <w:bookmarkEnd w:id="13"/>
+    </w:p>
+    <w:p/>
+    <w:p>
+      <w:pPr>
+        <w:pStyle w:val="a9"/>
+        <w:numPr>
+          <w:ilvl w:val="0"/>
+          <w:numId w:val="18"/>
+        </w:numPr>
+      </w:pPr>
+      <w:r>
+        <w:t xml:space="preserve">Игровые данные командира должны быть реализованы в отдельных </w:t>
+      </w:r>
+      <w:r>
+        <w:rPr>
+          <w:i/>
+          <w:iCs/>
+          <w:lang w:val="en-US"/>
+        </w:rPr>
+        <w:t>data</w:t>
+      </w:r>
+      <w:r>
+        <w:rPr>
+          <w:i/>
+          <w:iCs/>
+        </w:rPr>
+        <w:t xml:space="preserve"> </w:t>
+      </w:r>
+      <w:r>
+        <w:rPr>
+          <w:i/>
+          <w:iCs/>
+          <w:lang w:val="en-US"/>
+        </w:rPr>
+        <w:t>spaces</w:t>
+      </w:r>
+      <w:r>
+        <w:rPr>
+          <w:i/>
+          <w:iCs/>
+        </w:rPr>
+        <w:t>.</w:t>
+      </w:r>
+      <w:r>
+        <w:t xml:space="preserve"> </w:t>
+      </w:r>
+      <w:r>
+        <w:t xml:space="preserve">По пути </w:t>
+      </w:r>
+      <w:r>
+        <w:rPr>
+          <w:i/>
+          <w:iCs/>
+          <w:lang w:val="en-US"/>
+        </w:rPr>
+        <w:t>Base.SC2Data/</w:t>
+      </w:r>
+      <w:proofErr w:type="spellStart"/>
+      <w:r>
+        <w:rPr>
+          <w:i/>
+          <w:iCs/>
+          <w:lang w:val="en-US"/>
+        </w:rPr>
+        <w:t>GameData</w:t>
+      </w:r>
+      <w:proofErr w:type="spellEnd"/>
+      <w:r>
+        <w:rPr>
+          <w:i/>
+          <w:iCs/>
+          <w:lang w:val="en-US"/>
+        </w:rPr>
+        <w:t>/</w:t>
+      </w:r>
+      <w:r>
+        <w:rPr>
+          <w:i/>
+          <w:iCs/>
+          <w:lang w:val="en-US"/>
+        </w:rPr>
+        <w:t>{Commander}Data/{Unit}.xml</w:t>
+      </w:r>
+    </w:p>
+    <w:p>
+      <w:pPr>
+        <w:ind w:left="360"/>
+      </w:pPr>
+      <w:r>
+        <w:rPr>
+          <w:b/>
+          <w:bCs/>
+          <w:lang w:val="en-US"/>
+        </w:rPr>
+        <w:t>Data</w:t>
+      </w:r>
+      <w:r>
+        <w:rPr>
+          <w:b/>
+          <w:bCs/>
+        </w:rPr>
+        <w:t xml:space="preserve"> </w:t>
+      </w:r>
+      <w:r>
+        <w:rPr>
+          <w:b/>
+          <w:bCs/>
+          <w:lang w:val="en-US"/>
+        </w:rPr>
+        <w:t>space</w:t>
+      </w:r>
+      <w:r>
+        <w:t xml:space="preserve"> единицы должен содержать все данные</w:t>
+      </w:r>
+      <w:r>
+        <w:t xml:space="preserve">, </w:t>
+      </w:r>
+      <w:r>
+        <w:t xml:space="preserve">которые содержаться в </w:t>
+      </w:r>
+      <w:r>
+        <w:rPr>
+          <w:b/>
+          <w:bCs/>
+        </w:rPr>
+        <w:t>коллекции данных</w:t>
+      </w:r>
+      <w:r>
+        <w:t xml:space="preserve">, </w:t>
+      </w:r>
+      <w:r>
+        <w:t>включая и саму коллекцию</w:t>
+      </w:r>
+    </w:p>
+    <w:p>
+      <w:pPr>
+        <w:pStyle w:val="a9"/>
+        <w:numPr>
+          <w:ilvl w:val="0"/>
+          <w:numId w:val="18"/>
+        </w:numPr>
+      </w:pPr>
+      <w:r>
+        <w:t xml:space="preserve">В случае необходимости </w:t>
+      </w:r>
+      <w:proofErr w:type="spellStart"/>
+      <w:r>
+        <w:t>переиспользования</w:t>
+      </w:r>
+      <w:proofErr w:type="spellEnd"/>
+      <w:r>
+        <w:t xml:space="preserve"> каких-то существующих данных в другом </w:t>
+      </w:r>
+      <w:r>
+        <w:rPr>
+          <w:b/>
+          <w:bCs/>
+          <w:lang w:val="en-US"/>
+        </w:rPr>
+        <w:t>data</w:t>
+      </w:r>
+      <w:r>
+        <w:rPr>
+          <w:b/>
+          <w:bCs/>
+        </w:rPr>
+        <w:t xml:space="preserve"> </w:t>
+      </w:r>
+      <w:r>
+        <w:rPr>
+          <w:b/>
+          <w:bCs/>
+          <w:lang w:val="en-US"/>
+        </w:rPr>
+        <w:t>space</w:t>
+      </w:r>
+      <w:r>
+        <w:t xml:space="preserve">, </w:t>
+      </w:r>
+      <w:r>
+        <w:t>следует просто ссылаться на оригинальную реализацию нужных данных</w:t>
+      </w:r>
+      <w:r>
+        <w:t>,</w:t>
+      </w:r>
+    </w:p>
+    <w:p>
+      <w:pPr>
+        <w:ind w:left="360"/>
+        <w:rPr>
+          <w:i/>
+          <w:iCs/>
+        </w:rPr>
+      </w:pPr>
+      <w:r>
+        <w:rPr>
+          <w:i/>
+          <w:iCs/>
+        </w:rPr>
+        <w:t>Для примера</w:t>
+      </w:r>
+      <w:r>
+        <w:rPr>
+          <w:i/>
+          <w:iCs/>
+        </w:rPr>
+        <w:t xml:space="preserve">: </w:t>
+      </w:r>
+      <w:r>
+        <w:rPr>
+          <w:i/>
+          <w:iCs/>
+        </w:rPr>
+        <w:t xml:space="preserve">для новой единицы </w:t>
+      </w:r>
+      <w:r>
+        <w:rPr>
+          <w:i/>
+          <w:iCs/>
+        </w:rPr>
+        <w:t>“</w:t>
+      </w:r>
+      <w:r>
+        <w:rPr>
+          <w:i/>
+          <w:iCs/>
+          <w:lang w:val="en-US"/>
+        </w:rPr>
+        <w:t>Dark</w:t>
+      </w:r>
+      <w:r>
+        <w:rPr>
+          <w:i/>
+          <w:iCs/>
+        </w:rPr>
+        <w:t xml:space="preserve"> </w:t>
+      </w:r>
+      <w:r>
+        <w:rPr>
+          <w:i/>
+          <w:iCs/>
+          <w:lang w:val="en-US"/>
+        </w:rPr>
+        <w:t>Hunter</w:t>
+      </w:r>
+      <w:r>
+        <w:rPr>
+          <w:i/>
+          <w:iCs/>
+        </w:rPr>
+        <w:t>” (</w:t>
+      </w:r>
+      <w:r>
+        <w:rPr>
+          <w:b/>
+          <w:bCs/>
+          <w:i/>
+          <w:iCs/>
+          <w:lang w:val="en-US"/>
+        </w:rPr>
+        <w:t>DH</w:t>
+      </w:r>
+      <w:r>
+        <w:rPr>
+          <w:i/>
+          <w:iCs/>
+        </w:rPr>
+        <w:t xml:space="preserve">), </w:t>
+      </w:r>
+      <w:r>
+        <w:rPr>
+          <w:i/>
+          <w:iCs/>
+        </w:rPr>
+        <w:t xml:space="preserve">нужно использовать ту же способность </w:t>
+      </w:r>
+      <w:r>
+        <w:rPr>
+          <w:i/>
+          <w:iCs/>
+        </w:rPr>
+        <w:t>“</w:t>
+      </w:r>
+      <w:r>
+        <w:rPr>
+          <w:i/>
+          <w:iCs/>
+        </w:rPr>
+        <w:t>скачок</w:t>
+      </w:r>
+      <w:r>
+        <w:rPr>
+          <w:i/>
+          <w:iCs/>
+        </w:rPr>
+        <w:t>”</w:t>
+      </w:r>
+      <w:r>
+        <w:rPr>
+          <w:i/>
+          <w:iCs/>
+        </w:rPr>
+        <w:t xml:space="preserve"> что и у тёмного тамплиера (</w:t>
+      </w:r>
+      <w:r>
+        <w:rPr>
+          <w:b/>
+          <w:bCs/>
+          <w:i/>
+          <w:iCs/>
+          <w:lang w:val="en-US"/>
+        </w:rPr>
+        <w:t>DT</w:t>
+      </w:r>
+      <w:r>
+        <w:rPr>
+          <w:i/>
+          <w:iCs/>
+        </w:rPr>
+        <w:t>)</w:t>
+      </w:r>
+      <w:r>
+        <w:rPr>
+          <w:i/>
+          <w:iCs/>
+        </w:rPr>
+        <w:t xml:space="preserve"> </w:t>
+      </w:r>
+      <w:r>
+        <w:rPr>
+          <w:i/>
+          <w:iCs/>
+        </w:rPr>
+        <w:t xml:space="preserve">командира </w:t>
+      </w:r>
+      <w:proofErr w:type="spellStart"/>
+      <w:r>
+        <w:rPr>
+          <w:i/>
+          <w:iCs/>
+        </w:rPr>
+        <w:t>Воразун</w:t>
+      </w:r>
+      <w:proofErr w:type="spellEnd"/>
+      <w:r>
+        <w:rPr>
+          <w:i/>
+          <w:iCs/>
+        </w:rPr>
+        <w:t>.</w:t>
+      </w:r>
+      <w:r>
+        <w:rPr>
+          <w:i/>
+          <w:iCs/>
+        </w:rPr>
+        <w:t xml:space="preserve"> В таком случае не нужно реализовывать копию скачка </w:t>
+      </w:r>
+      <w:r>
+        <w:rPr>
+          <w:b/>
+          <w:bCs/>
+          <w:i/>
+          <w:iCs/>
+          <w:lang w:val="en-US"/>
+        </w:rPr>
+        <w:t>DT</w:t>
+      </w:r>
+      <w:r>
+        <w:rPr>
+          <w:i/>
+          <w:iCs/>
+        </w:rPr>
+        <w:t xml:space="preserve"> в пространстве </w:t>
+      </w:r>
+      <w:r>
+        <w:rPr>
+          <w:b/>
+          <w:bCs/>
+          <w:i/>
+          <w:iCs/>
+          <w:lang w:val="en-US"/>
+        </w:rPr>
+        <w:t>DH</w:t>
+      </w:r>
+      <w:r>
+        <w:rPr>
+          <w:i/>
+          <w:iCs/>
+        </w:rPr>
+        <w:t xml:space="preserve">, </w:t>
+      </w:r>
+      <w:r>
+        <w:rPr>
+          <w:i/>
+          <w:iCs/>
+        </w:rPr>
+        <w:t>допускается использование прямой ссылки на готовую способность</w:t>
+      </w:r>
+      <w:r>
+        <w:rPr>
+          <w:i/>
+          <w:iCs/>
+        </w:rPr>
+        <w:t>.</w:t>
+      </w:r>
+    </w:p>
+    <w:p>
+      <w:pPr>
+        <w:ind w:left="360"/>
+        <w:rPr>
+          <w:i/>
+          <w:iCs/>
+        </w:rPr>
+      </w:pPr>
+      <w:r>
+        <w:rPr>
+          <w:i/>
+          <w:iCs/>
+        </w:rPr>
+        <w:t>Это распространяется только на те данные</w:t>
+      </w:r>
+      <w:r>
+        <w:rPr>
+          <w:i/>
+          <w:iCs/>
+        </w:rPr>
+        <w:t xml:space="preserve">, </w:t>
+      </w:r>
+      <w:r>
+        <w:rPr>
+          <w:i/>
+          <w:iCs/>
+        </w:rPr>
+        <w:t>что реализованы внутри текущей модификации командира</w:t>
+      </w:r>
+    </w:p>
+    <w:p/>
+    <w:p>
+      <w:r>
+        <w:br w:type="page"/>
+      </w:r>
+    </w:p>
+    <w:p>
+      <w:pPr>
+        <w:pStyle w:val="1"/>
+        <w:jc w:val="center"/>
         <w:rPr>
           <w:rFonts w:cstheme="majorHAnsi"/>
         </w:rPr>
       </w:pPr>
-      <w:bookmarkStart w:id="11" w:name="_Toc205324073"/>
+      <w:bookmarkStart w:id="14" w:name="_Toc219644138"/>
       <w:r>
         <w:rPr>
           <w:rFonts w:cstheme="majorHAnsi"/>
@@ -3649,12 +4802,20 @@
         </w:rPr>
         <w:t>)</w:t>
       </w:r>
-      <w:bookmarkEnd w:id="11"/>
+      <w:bookmarkEnd w:id="14"/>
     </w:p>
     <w:p/>
     <w:p>
       <w:r>
-        <w:t xml:space="preserve">Эта глава посвящена разработке мастеров (визардов) для набора библиотек </w:t>
+        <w:t>Эта глава посвящена разработке мастеров (</w:t>
+      </w:r>
+      <w:proofErr w:type="spellStart"/>
+      <w:r>
+        <w:t>визардов</w:t>
+      </w:r>
+      <w:proofErr w:type="spellEnd"/>
+      <w:r>
+        <w:t xml:space="preserve">) для набора библиотек </w:t>
       </w:r>
     </w:p>
     <w:p>
@@ -3668,11 +4829,11 @@
       <w:pPr>
         <w:pStyle w:val="2"/>
       </w:pPr>
-      <w:bookmarkStart w:id="12" w:name="_Toc205324074"/>
+      <w:bookmarkStart w:id="15" w:name="_Toc219644139"/>
       <w:r>
         <w:t>Общее</w:t>
       </w:r>
-      <w:bookmarkEnd w:id="12"/>
+      <w:bookmarkEnd w:id="15"/>
     </w:p>
     <w:p/>
     <w:p>
@@ -3755,6 +4916,7 @@
         </w:rPr>
         <w:t>instructions</w:t>
       </w:r>
+      <w:proofErr w:type="gramStart"/>
       <w:r>
         <w:rPr>
           <w:b/>
@@ -3762,6 +4924,7 @@
         </w:rPr>
         <w:t>&gt;&lt; /</w:t>
       </w:r>
+      <w:proofErr w:type="gramEnd"/>
       <w:r>
         <w:rPr>
           <w:b/>
@@ -3826,12 +4989,12 @@
         <w:pStyle w:val="1"/>
         <w:jc w:val="center"/>
       </w:pPr>
-      <w:bookmarkStart w:id="13" w:name="_Toc205324075"/>
+      <w:bookmarkStart w:id="16" w:name="_Toc219644140"/>
       <w:r>
         <w:lastRenderedPageBreak/>
         <w:t>Структура игровых данных</w:t>
       </w:r>
-      <w:bookmarkEnd w:id="13"/>
+      <w:bookmarkEnd w:id="16"/>
     </w:p>
     <w:p/>
     <w:p>
@@ -3895,11 +5058,16 @@
       <w:r>
         <w:t>Пример</w:t>
       </w:r>
+      <w:proofErr w:type="gramStart"/>
       <w:r>
         <w:t xml:space="preserve">: </w:t>
       </w:r>
       <w:r>
-        <w:t xml:space="preserve">Если у коллекции данных </w:t>
+        <w:t>Если</w:t>
+      </w:r>
+      <w:proofErr w:type="gramEnd"/>
+      <w:r>
+        <w:t xml:space="preserve"> у коллекции данных </w:t>
       </w:r>
       <w:r>
         <w:t>“</w:t>
@@ -4006,11 +5174,11 @@
       <w:pPr>
         <w:pStyle w:val="2"/>
       </w:pPr>
-      <w:bookmarkStart w:id="14" w:name="_Toc205324076"/>
+      <w:bookmarkStart w:id="17" w:name="_Toc219644141"/>
       <w:r>
         <w:t>Единицы</w:t>
       </w:r>
-      <w:bookmarkEnd w:id="14"/>
+      <w:bookmarkEnd w:id="17"/>
     </w:p>
     <w:p/>
     <w:p>
@@ -4026,12 +5194,14 @@
       <w:r>
         <w:t xml:space="preserve"> </w:t>
       </w:r>
+      <w:proofErr w:type="spellStart"/>
       <w:r>
         <w:rPr>
           <w:lang w:val="en-CA"/>
         </w:rPr>
         <w:t>Collecion</w:t>
       </w:r>
+      <w:proofErr w:type="spellEnd"/>
       <w:r>
         <w:t>)</w:t>
       </w:r>
@@ -4085,6 +5255,7 @@
           <w:lang w:val="en-CA"/>
         </w:rPr>
       </w:pPr>
+      <w:proofErr w:type="spellStart"/>
       <w:r>
         <w:rPr>
           <w:b/>
@@ -4092,6 +5263,7 @@
         </w:rPr>
         <w:t>Актор</w:t>
       </w:r>
+      <w:proofErr w:type="spellEnd"/>
       <w:r>
         <w:t xml:space="preserve">, </w:t>
       </w:r>
@@ -4228,11 +5400,11 @@
       <w:pPr>
         <w:pStyle w:val="2"/>
       </w:pPr>
-      <w:bookmarkStart w:id="15" w:name="_Toc205324077"/>
+      <w:bookmarkStart w:id="18" w:name="_Toc219644142"/>
       <w:r>
         <w:t>Способности</w:t>
       </w:r>
-      <w:bookmarkEnd w:id="15"/>
+      <w:bookmarkEnd w:id="18"/>
     </w:p>
     <w:p/>
     <w:p/>
@@ -4240,11 +5412,11 @@
       <w:pPr>
         <w:pStyle w:val="2"/>
       </w:pPr>
-      <w:bookmarkStart w:id="16" w:name="_Toc205324078"/>
+      <w:bookmarkStart w:id="19" w:name="_Toc219644143"/>
       <w:r>
         <w:t>Оружия</w:t>
       </w:r>
-      <w:bookmarkEnd w:id="16"/>
+      <w:bookmarkEnd w:id="19"/>
     </w:p>
     <w:sectPr>
       <w:footerReference w:type="default" r:id="rId8"/>
@@ -4675,6 +5847,95 @@
     </w:lvl>
   </w:abstractNum>
   <w:abstractNum w:abstractNumId="3" w15:restartNumberingAfterBreak="0">
+    <w:nsid w:val="23331C7D"/>
+    <w:multiLevelType w:val="hybridMultilevel"/>
+    <w:tmpl w:val="E3CCAFC4"/>
+    <w:lvl w:ilvl="0" w:tplc="0419000F">
+      <w:start w:val="1"/>
+      <w:numFmt w:val="decimal"/>
+      <w:lvlText w:val="%1."/>
+      <w:lvlJc w:val="left"/>
+      <w:pPr>
+        <w:ind w:left="720" w:hanging="360"/>
+      </w:pPr>
+      <w:rPr>
+        <w:rFonts w:hint="default"/>
+      </w:rPr>
+    </w:lvl>
+    <w:lvl w:ilvl="1" w:tplc="04190019" w:tentative="1">
+      <w:start w:val="1"/>
+      <w:numFmt w:val="lowerLetter"/>
+      <w:lvlText w:val="%2."/>
+      <w:lvlJc w:val="left"/>
+      <w:pPr>
+        <w:ind w:left="1440" w:hanging="360"/>
+      </w:pPr>
+    </w:lvl>
+    <w:lvl w:ilvl="2" w:tplc="0419001B" w:tentative="1">
+      <w:start w:val="1"/>
+      <w:numFmt w:val="lowerRoman"/>
+      <w:lvlText w:val="%3."/>
+      <w:lvlJc w:val="right"/>
+      <w:pPr>
+        <w:ind w:left="2160" w:hanging="180"/>
+      </w:pPr>
+    </w:lvl>
+    <w:lvl w:ilvl="3" w:tplc="0419000F" w:tentative="1">
+      <w:start w:val="1"/>
+      <w:numFmt w:val="decimal"/>
+      <w:lvlText w:val="%4."/>
+      <w:lvlJc w:val="left"/>
+      <w:pPr>
+        <w:ind w:left="2880" w:hanging="360"/>
+      </w:pPr>
+    </w:lvl>
+    <w:lvl w:ilvl="4" w:tplc="04190019" w:tentative="1">
+      <w:start w:val="1"/>
+      <w:numFmt w:val="lowerLetter"/>
+      <w:lvlText w:val="%5."/>
+      <w:lvlJc w:val="left"/>
+      <w:pPr>
+        <w:ind w:left="3600" w:hanging="360"/>
+      </w:pPr>
+    </w:lvl>
+    <w:lvl w:ilvl="5" w:tplc="0419001B" w:tentative="1">
+      <w:start w:val="1"/>
+      <w:numFmt w:val="lowerRoman"/>
+      <w:lvlText w:val="%6."/>
+      <w:lvlJc w:val="right"/>
+      <w:pPr>
+        <w:ind w:left="4320" w:hanging="180"/>
+      </w:pPr>
+    </w:lvl>
+    <w:lvl w:ilvl="6" w:tplc="0419000F" w:tentative="1">
+      <w:start w:val="1"/>
+      <w:numFmt w:val="decimal"/>
+      <w:lvlText w:val="%7."/>
+      <w:lvlJc w:val="left"/>
+      <w:pPr>
+        <w:ind w:left="5040" w:hanging="360"/>
+      </w:pPr>
+    </w:lvl>
+    <w:lvl w:ilvl="7" w:tplc="04190019" w:tentative="1">
+      <w:start w:val="1"/>
+      <w:numFmt w:val="lowerLetter"/>
+      <w:lvlText w:val="%8."/>
+      <w:lvlJc w:val="left"/>
+      <w:pPr>
+        <w:ind w:left="5760" w:hanging="360"/>
+      </w:pPr>
+    </w:lvl>
+    <w:lvl w:ilvl="8" w:tplc="0419001B" w:tentative="1">
+      <w:start w:val="1"/>
+      <w:numFmt w:val="lowerRoman"/>
+      <w:lvlText w:val="%9."/>
+      <w:lvlJc w:val="right"/>
+      <w:pPr>
+        <w:ind w:left="6480" w:hanging="180"/>
+      </w:pPr>
+    </w:lvl>
+  </w:abstractNum>
+  <w:abstractNum w:abstractNumId="4" w15:restartNumberingAfterBreak="0">
     <w:nsid w:val="256D77D4"/>
     <w:multiLevelType w:val="hybridMultilevel"/>
     <w:tmpl w:val="D7F67970"/>
@@ -4763,7 +6024,7 @@
       </w:pPr>
     </w:lvl>
   </w:abstractNum>
-  <w:abstractNum w:abstractNumId="4" w15:restartNumberingAfterBreak="0">
+  <w:abstractNum w:abstractNumId="5" w15:restartNumberingAfterBreak="0">
     <w:nsid w:val="28A62CEA"/>
     <w:multiLevelType w:val="hybridMultilevel"/>
     <w:tmpl w:val="BFA222B4"/>
@@ -4852,7 +6113,7 @@
       </w:pPr>
     </w:lvl>
   </w:abstractNum>
-  <w:abstractNum w:abstractNumId="5" w15:restartNumberingAfterBreak="0">
+  <w:abstractNum w:abstractNumId="6" w15:restartNumberingAfterBreak="0">
     <w:nsid w:val="3B6665CB"/>
     <w:multiLevelType w:val="hybridMultilevel"/>
     <w:tmpl w:val="5C186B36"/>
@@ -4941,7 +6202,7 @@
       </w:pPr>
     </w:lvl>
   </w:abstractNum>
-  <w:abstractNum w:abstractNumId="6" w15:restartNumberingAfterBreak="0">
+  <w:abstractNum w:abstractNumId="7" w15:restartNumberingAfterBreak="0">
     <w:nsid w:val="3BF85050"/>
     <w:multiLevelType w:val="hybridMultilevel"/>
     <w:tmpl w:val="07B4D018"/>
@@ -5030,7 +6291,7 @@
       </w:pPr>
     </w:lvl>
   </w:abstractNum>
-  <w:abstractNum w:abstractNumId="7" w15:restartNumberingAfterBreak="0">
+  <w:abstractNum w:abstractNumId="8" w15:restartNumberingAfterBreak="0">
     <w:nsid w:val="418B36DF"/>
     <w:multiLevelType w:val="hybridMultilevel"/>
     <w:tmpl w:val="B2026C88"/>
@@ -5121,7 +6382,7 @@
       </w:pPr>
     </w:lvl>
   </w:abstractNum>
-  <w:abstractNum w:abstractNumId="8" w15:restartNumberingAfterBreak="0">
+  <w:abstractNum w:abstractNumId="9" w15:restartNumberingAfterBreak="0">
     <w:nsid w:val="46195FC3"/>
     <w:multiLevelType w:val="hybridMultilevel"/>
     <w:tmpl w:val="4846FFDE"/>
@@ -5212,7 +6473,7 @@
       </w:pPr>
     </w:lvl>
   </w:abstractNum>
-  <w:abstractNum w:abstractNumId="9" w15:restartNumberingAfterBreak="0">
+  <w:abstractNum w:abstractNumId="10" w15:restartNumberingAfterBreak="0">
     <w:nsid w:val="52B37197"/>
     <w:multiLevelType w:val="hybridMultilevel"/>
     <w:tmpl w:val="06344BEA"/>
@@ -5301,7 +6562,7 @@
       </w:pPr>
     </w:lvl>
   </w:abstractNum>
-  <w:abstractNum w:abstractNumId="10" w15:restartNumberingAfterBreak="0">
+  <w:abstractNum w:abstractNumId="11" w15:restartNumberingAfterBreak="0">
     <w:nsid w:val="54D07906"/>
     <w:multiLevelType w:val="hybridMultilevel"/>
     <w:tmpl w:val="4126E1A6"/>
@@ -5390,7 +6651,7 @@
       </w:pPr>
     </w:lvl>
   </w:abstractNum>
-  <w:abstractNum w:abstractNumId="11" w15:restartNumberingAfterBreak="0">
+  <w:abstractNum w:abstractNumId="12" w15:restartNumberingAfterBreak="0">
     <w:nsid w:val="5A595613"/>
     <w:multiLevelType w:val="hybridMultilevel"/>
     <w:tmpl w:val="C15C6D24"/>
@@ -5481,7 +6742,7 @@
       </w:pPr>
     </w:lvl>
   </w:abstractNum>
-  <w:abstractNum w:abstractNumId="12" w15:restartNumberingAfterBreak="0">
+  <w:abstractNum w:abstractNumId="13" w15:restartNumberingAfterBreak="0">
     <w:nsid w:val="5AE417BE"/>
     <w:multiLevelType w:val="hybridMultilevel"/>
     <w:tmpl w:val="5BA67AB0"/>
@@ -5570,7 +6831,7 @@
       </w:pPr>
     </w:lvl>
   </w:abstractNum>
-  <w:abstractNum w:abstractNumId="13" w15:restartNumberingAfterBreak="0">
+  <w:abstractNum w:abstractNumId="14" w15:restartNumberingAfterBreak="0">
     <w:nsid w:val="60881409"/>
     <w:multiLevelType w:val="hybridMultilevel"/>
     <w:tmpl w:val="6106ACEE"/>
@@ -5659,7 +6920,7 @@
       </w:pPr>
     </w:lvl>
   </w:abstractNum>
-  <w:abstractNum w:abstractNumId="14" w15:restartNumberingAfterBreak="0">
+  <w:abstractNum w:abstractNumId="15" w15:restartNumberingAfterBreak="0">
     <w:nsid w:val="6A076694"/>
     <w:multiLevelType w:val="hybridMultilevel"/>
     <w:tmpl w:val="C96826F2"/>
@@ -5748,7 +7009,7 @@
       </w:pPr>
     </w:lvl>
   </w:abstractNum>
-  <w:abstractNum w:abstractNumId="15" w15:restartNumberingAfterBreak="0">
+  <w:abstractNum w:abstractNumId="16" w15:restartNumberingAfterBreak="0">
     <w:nsid w:val="6EAB575D"/>
     <w:multiLevelType w:val="hybridMultilevel"/>
     <w:tmpl w:val="9D0C58AA"/>
@@ -5837,7 +7098,7 @@
       </w:pPr>
     </w:lvl>
   </w:abstractNum>
-  <w:abstractNum w:abstractNumId="16" w15:restartNumberingAfterBreak="0">
+  <w:abstractNum w:abstractNumId="17" w15:restartNumberingAfterBreak="0">
     <w:nsid w:val="73414BE5"/>
     <w:multiLevelType w:val="hybridMultilevel"/>
     <w:tmpl w:val="A8DA2260"/>
@@ -5927,55 +7188,58 @@
     </w:lvl>
   </w:abstractNum>
   <w:num w:numId="1">
-    <w:abstractNumId w:val="11"/>
+    <w:abstractNumId w:val="12"/>
   </w:num>
   <w:num w:numId="2">
     <w:abstractNumId w:val="2"/>
   </w:num>
   <w:num w:numId="3">
-    <w:abstractNumId w:val="3"/>
+    <w:abstractNumId w:val="4"/>
   </w:num>
   <w:num w:numId="4">
+    <w:abstractNumId w:val="14"/>
+  </w:num>
+  <w:num w:numId="5">
+    <w:abstractNumId w:val="9"/>
+  </w:num>
+  <w:num w:numId="6">
+    <w:abstractNumId w:val="8"/>
+  </w:num>
+  <w:num w:numId="7">
+    <w:abstractNumId w:val="10"/>
+  </w:num>
+  <w:num w:numId="8">
     <w:abstractNumId w:val="13"/>
   </w:num>
-  <w:num w:numId="5">
-    <w:abstractNumId w:val="8"/>
-  </w:num>
-  <w:num w:numId="6">
+  <w:num w:numId="9">
     <w:abstractNumId w:val="7"/>
   </w:num>
-  <w:num w:numId="7">
-    <w:abstractNumId w:val="9"/>
+  <w:num w:numId="10">
+    <w:abstractNumId w:val="17"/>
   </w:num>
-  <w:num w:numId="8">
-    <w:abstractNumId w:val="12"/>
-  </w:num>
-  <w:num w:numId="9">
-    <w:abstractNumId w:val="6"/>
-  </w:num>
-  <w:num w:numId="10">
+  <w:num w:numId="11">
     <w:abstractNumId w:val="16"/>
   </w:num>
-  <w:num w:numId="11">
+  <w:num w:numId="12">
     <w:abstractNumId w:val="15"/>
-  </w:num>
-  <w:num w:numId="12">
-    <w:abstractNumId w:val="14"/>
   </w:num>
   <w:num w:numId="13">
     <w:abstractNumId w:val="1"/>
   </w:num>
   <w:num w:numId="14">
-    <w:abstractNumId w:val="4"/>
+    <w:abstractNumId w:val="5"/>
   </w:num>
   <w:num w:numId="15">
     <w:abstractNumId w:val="0"/>
   </w:num>
   <w:num w:numId="16">
-    <w:abstractNumId w:val="5"/>
+    <w:abstractNumId w:val="6"/>
   </w:num>
   <w:num w:numId="17">
-    <w:abstractNumId w:val="10"/>
+    <w:abstractNumId w:val="11"/>
+  </w:num>
+  <w:num w:numId="18">
+    <w:abstractNumId w:val="3"/>
   </w:num>
 </w:numbering>
 </file>

</xml_diff>